<commit_message>
ajout screen shot pour rapport
</commit_message>
<xml_diff>
--- a/420-414-TP3-rapport .docx
+++ b/420-414-TP3-rapport .docx
@@ -2284,31 +2284,22 @@
           <w:sz w:val="24"/>
           <w:szCs w:val="24"/>
         </w:rPr>
-        <w:t xml:space="preserve">Dans cette partie, </w:t>
-      </w:r>
-      <w:r>
-        <w:rPr>
-          <w:rFonts w:ascii="Times New Roman" w:hAnsi="Times New Roman" w:cs="Times New Roman"/>
-          <w:i/>
-          <w:color w:val="073763"/>
-          <w:sz w:val="24"/>
-          <w:szCs w:val="24"/>
-        </w:rPr>
-        <w:t>insérez votre fichier docker compose et expliquez la configuration.</w:t>
-      </w:r>
-    </w:p>
-    <w:p>
-      <w:pPr>
-        <w:shd w:val="clear" w:color="auto" w:fill="1F1F1F"/>
-        <w:spacing w:line="285" w:lineRule="atLeast"/>
-        <w:rPr>
-          <w:rFonts w:ascii="Consolas" w:eastAsia="Times New Roman" w:hAnsi="Consolas" w:cs="Times New Roman"/>
-          <w:color w:val="CCCCCC"/>
-          <w:sz w:val="21"/>
-          <w:szCs w:val="21"/>
-          <w:lang w:val="fr-CA" w:eastAsia="fr-CA"/>
-        </w:rPr>
-      </w:pPr>
+        <w:t>Dans cette partie, insérez votre fichier docker compose et expliquez la configuration.</w:t>
+      </w:r>
+    </w:p>
+    <w:p>
+      <w:pPr>
+        <w:shd w:val="clear" w:color="auto" w:fill="1F1F1F"/>
+        <w:spacing w:line="285" w:lineRule="atLeast"/>
+        <w:rPr>
+          <w:rFonts w:ascii="Consolas" w:eastAsia="Times New Roman" w:hAnsi="Consolas" w:cs="Times New Roman"/>
+          <w:color w:val="CCCCCC"/>
+          <w:sz w:val="21"/>
+          <w:szCs w:val="21"/>
+          <w:lang w:val="fr-CA" w:eastAsia="fr-CA"/>
+        </w:rPr>
+      </w:pPr>
+      <w:proofErr w:type="gramStart"/>
       <w:r>
         <w:rPr>
           <w:rFonts w:ascii="Consolas" w:eastAsia="Times New Roman" w:hAnsi="Consolas" w:cs="Times New Roman"/>
@@ -2319,6 +2310,7 @@
         </w:rPr>
         <w:t>services</w:t>
       </w:r>
+      <w:proofErr w:type="gramEnd"/>
       <w:r>
         <w:rPr>
           <w:rFonts w:ascii="Consolas" w:eastAsia="Times New Roman" w:hAnsi="Consolas" w:cs="Times New Roman"/>
@@ -2386,6 +2378,7 @@
         <w:t xml:space="preserve">  </w:t>
       </w:r>
       <w:proofErr w:type="spellStart"/>
+      <w:proofErr w:type="gramStart"/>
       <w:r>
         <w:rPr>
           <w:rFonts w:ascii="Consolas" w:eastAsia="Times New Roman" w:hAnsi="Consolas" w:cs="Times New Roman"/>
@@ -2397,6 +2390,7 @@
         <w:t>portainer</w:t>
       </w:r>
       <w:proofErr w:type="spellEnd"/>
+      <w:proofErr w:type="gramEnd"/>
       <w:r>
         <w:rPr>
           <w:rFonts w:ascii="Consolas" w:eastAsia="Times New Roman" w:hAnsi="Consolas" w:cs="Times New Roman"/>
@@ -2463,6 +2457,7 @@
         </w:rPr>
         <w:t xml:space="preserve">    </w:t>
       </w:r>
+      <w:proofErr w:type="gramStart"/>
       <w:r>
         <w:rPr>
           <w:rFonts w:ascii="Consolas" w:eastAsia="Times New Roman" w:hAnsi="Consolas" w:cs="Times New Roman"/>
@@ -2473,6 +2468,7 @@
         </w:rPr>
         <w:t>image</w:t>
       </w:r>
+      <w:proofErr w:type="gramEnd"/>
       <w:r>
         <w:rPr>
           <w:rFonts w:ascii="Consolas" w:eastAsia="Times New Roman" w:hAnsi="Consolas" w:cs="Times New Roman"/>
@@ -2574,6 +2570,7 @@
         <w:t xml:space="preserve">    </w:t>
       </w:r>
       <w:proofErr w:type="spellStart"/>
+      <w:proofErr w:type="gramStart"/>
       <w:r>
         <w:rPr>
           <w:rFonts w:ascii="Consolas" w:eastAsia="Times New Roman" w:hAnsi="Consolas" w:cs="Times New Roman"/>
@@ -2582,7 +2579,18 @@
           <w:szCs w:val="21"/>
           <w:lang w:val="fr-CA" w:eastAsia="fr-CA"/>
         </w:rPr>
-        <w:t>container_name</w:t>
+        <w:t>container</w:t>
+      </w:r>
+      <w:proofErr w:type="gramEnd"/>
+      <w:r>
+        <w:rPr>
+          <w:rFonts w:ascii="Consolas" w:eastAsia="Times New Roman" w:hAnsi="Consolas" w:cs="Times New Roman"/>
+          <w:color w:val="569CD6"/>
+          <w:sz w:val="21"/>
+          <w:szCs w:val="21"/>
+          <w:lang w:val="fr-CA" w:eastAsia="fr-CA"/>
+        </w:rPr>
+        <w:t>_name</w:t>
       </w:r>
       <w:proofErr w:type="spellEnd"/>
       <w:r>
@@ -2663,6 +2671,7 @@
         </w:rPr>
         <w:t xml:space="preserve">    </w:t>
       </w:r>
+      <w:proofErr w:type="gramStart"/>
       <w:r>
         <w:rPr>
           <w:rFonts w:ascii="Consolas" w:eastAsia="Times New Roman" w:hAnsi="Consolas" w:cs="Times New Roman"/>
@@ -2673,6 +2682,7 @@
         </w:rPr>
         <w:t>restart</w:t>
       </w:r>
+      <w:proofErr w:type="gramEnd"/>
       <w:r>
         <w:rPr>
           <w:rFonts w:ascii="Consolas" w:eastAsia="Times New Roman" w:hAnsi="Consolas" w:cs="Times New Roman"/>
@@ -2751,6 +2761,7 @@
         </w:rPr>
         <w:t xml:space="preserve">    </w:t>
       </w:r>
+      <w:proofErr w:type="gramStart"/>
       <w:r>
         <w:rPr>
           <w:rFonts w:ascii="Consolas" w:eastAsia="Times New Roman" w:hAnsi="Consolas" w:cs="Times New Roman"/>
@@ -2761,6 +2772,7 @@
         </w:rPr>
         <w:t>networks</w:t>
       </w:r>
+      <w:proofErr w:type="gramEnd"/>
       <w:r>
         <w:rPr>
           <w:rFonts w:ascii="Consolas" w:eastAsia="Times New Roman" w:hAnsi="Consolas" w:cs="Times New Roman"/>
@@ -2861,6 +2873,7 @@
         </w:rPr>
         <w:t xml:space="preserve">    </w:t>
       </w:r>
+      <w:proofErr w:type="gramStart"/>
       <w:r>
         <w:rPr>
           <w:rFonts w:ascii="Consolas" w:eastAsia="Times New Roman" w:hAnsi="Consolas" w:cs="Times New Roman"/>
@@ -2871,6 +2884,7 @@
         </w:rPr>
         <w:t>ports</w:t>
       </w:r>
+      <w:proofErr w:type="gramEnd"/>
       <w:r>
         <w:rPr>
           <w:rFonts w:ascii="Consolas" w:eastAsia="Times New Roman" w:hAnsi="Consolas" w:cs="Times New Roman"/>
@@ -3207,7 +3221,29 @@
           <w:szCs w:val="21"/>
           <w:lang w:val="en-US" w:eastAsia="fr-CA"/>
         </w:rPr>
-        <w:t>'traefik.enable=true'</w:t>
+        <w:t>'</w:t>
+      </w:r>
+      <w:proofErr w:type="gramStart"/>
+      <w:r>
+        <w:rPr>
+          <w:rFonts w:ascii="Consolas" w:eastAsia="Times New Roman" w:hAnsi="Consolas" w:cs="Times New Roman"/>
+          <w:color w:val="CE9178"/>
+          <w:sz w:val="21"/>
+          <w:szCs w:val="21"/>
+          <w:lang w:val="en-US" w:eastAsia="fr-CA"/>
+        </w:rPr>
+        <w:t>traefik.enable</w:t>
+      </w:r>
+      <w:proofErr w:type="gramEnd"/>
+      <w:r>
+        <w:rPr>
+          <w:rFonts w:ascii="Consolas" w:eastAsia="Times New Roman" w:hAnsi="Consolas" w:cs="Times New Roman"/>
+          <w:color w:val="CE9178"/>
+          <w:sz w:val="21"/>
+          <w:szCs w:val="21"/>
+          <w:lang w:val="en-US" w:eastAsia="fr-CA"/>
+        </w:rPr>
+        <w:t>=true'</w:t>
       </w:r>
     </w:p>
     <w:p>
@@ -3240,7 +3276,29 @@
           <w:szCs w:val="21"/>
           <w:lang w:val="en-US" w:eastAsia="fr-CA"/>
         </w:rPr>
-        <w:t>'traefik.http.routers.portainer.rule=Host(`portainer.${MY_DOMAIN}`)'</w:t>
+        <w:t>'</w:t>
+      </w:r>
+      <w:proofErr w:type="gramStart"/>
+      <w:r>
+        <w:rPr>
+          <w:rFonts w:ascii="Consolas" w:eastAsia="Times New Roman" w:hAnsi="Consolas" w:cs="Times New Roman"/>
+          <w:color w:val="CE9178"/>
+          <w:sz w:val="21"/>
+          <w:szCs w:val="21"/>
+          <w:lang w:val="en-US" w:eastAsia="fr-CA"/>
+        </w:rPr>
+        <w:t>traefik.http</w:t>
+      </w:r>
+      <w:proofErr w:type="gramEnd"/>
+      <w:r>
+        <w:rPr>
+          <w:rFonts w:ascii="Consolas" w:eastAsia="Times New Roman" w:hAnsi="Consolas" w:cs="Times New Roman"/>
+          <w:color w:val="CE9178"/>
+          <w:sz w:val="21"/>
+          <w:szCs w:val="21"/>
+          <w:lang w:val="en-US" w:eastAsia="fr-CA"/>
+        </w:rPr>
+        <w:t>.routers.portainer.rule=Host(`portainer.${MY_DOMAIN}`)'</w:t>
       </w:r>
     </w:p>
     <w:p>
@@ -3273,7 +3331,29 @@
           <w:szCs w:val="21"/>
           <w:lang w:val="en-US" w:eastAsia="fr-CA"/>
         </w:rPr>
-        <w:t>'traefik.http.routers.portainer.entryPoints=websecure'</w:t>
+        <w:t>'</w:t>
+      </w:r>
+      <w:proofErr w:type="gramStart"/>
+      <w:r>
+        <w:rPr>
+          <w:rFonts w:ascii="Consolas" w:eastAsia="Times New Roman" w:hAnsi="Consolas" w:cs="Times New Roman"/>
+          <w:color w:val="CE9178"/>
+          <w:sz w:val="21"/>
+          <w:szCs w:val="21"/>
+          <w:lang w:val="en-US" w:eastAsia="fr-CA"/>
+        </w:rPr>
+        <w:t>traefik.http</w:t>
+      </w:r>
+      <w:proofErr w:type="gramEnd"/>
+      <w:r>
+        <w:rPr>
+          <w:rFonts w:ascii="Consolas" w:eastAsia="Times New Roman" w:hAnsi="Consolas" w:cs="Times New Roman"/>
+          <w:color w:val="CE9178"/>
+          <w:sz w:val="21"/>
+          <w:szCs w:val="21"/>
+          <w:lang w:val="en-US" w:eastAsia="fr-CA"/>
+        </w:rPr>
+        <w:t>.routers.portainer.entryPoints=websecure'</w:t>
       </w:r>
     </w:p>
     <w:p>
@@ -3345,6 +3425,7 @@
         <w:t xml:space="preserve">  </w:t>
       </w:r>
       <w:proofErr w:type="spellStart"/>
+      <w:proofErr w:type="gramStart"/>
       <w:r>
         <w:rPr>
           <w:rFonts w:ascii="Consolas" w:eastAsia="Times New Roman" w:hAnsi="Consolas" w:cs="Times New Roman"/>
@@ -3356,6 +3437,7 @@
         <w:t>nextclouddb</w:t>
       </w:r>
       <w:proofErr w:type="spellEnd"/>
+      <w:proofErr w:type="gramEnd"/>
       <w:r>
         <w:rPr>
           <w:rFonts w:ascii="Consolas" w:eastAsia="Times New Roman" w:hAnsi="Consolas" w:cs="Times New Roman"/>
@@ -3422,6 +3504,7 @@
         </w:rPr>
         <w:t xml:space="preserve">    </w:t>
       </w:r>
+      <w:proofErr w:type="gramStart"/>
       <w:r>
         <w:rPr>
           <w:rFonts w:ascii="Consolas" w:eastAsia="Times New Roman" w:hAnsi="Consolas" w:cs="Times New Roman"/>
@@ -3432,6 +3515,7 @@
         </w:rPr>
         <w:t>image</w:t>
       </w:r>
+      <w:proofErr w:type="gramEnd"/>
       <w:r>
         <w:rPr>
           <w:rFonts w:ascii="Consolas" w:eastAsia="Times New Roman" w:hAnsi="Consolas" w:cs="Times New Roman"/>
@@ -3511,6 +3595,7 @@
         <w:t xml:space="preserve">    </w:t>
       </w:r>
       <w:proofErr w:type="spellStart"/>
+      <w:proofErr w:type="gramStart"/>
       <w:r>
         <w:rPr>
           <w:rFonts w:ascii="Consolas" w:eastAsia="Times New Roman" w:hAnsi="Consolas" w:cs="Times New Roman"/>
@@ -3519,7 +3604,18 @@
           <w:szCs w:val="21"/>
           <w:lang w:val="fr-CA" w:eastAsia="fr-CA"/>
         </w:rPr>
-        <w:t>container_name</w:t>
+        <w:t>container</w:t>
+      </w:r>
+      <w:proofErr w:type="gramEnd"/>
+      <w:r>
+        <w:rPr>
+          <w:rFonts w:ascii="Consolas" w:eastAsia="Times New Roman" w:hAnsi="Consolas" w:cs="Times New Roman"/>
+          <w:color w:val="569CD6"/>
+          <w:sz w:val="21"/>
+          <w:szCs w:val="21"/>
+          <w:lang w:val="fr-CA" w:eastAsia="fr-CA"/>
+        </w:rPr>
+        <w:t>_name</w:t>
       </w:r>
       <w:proofErr w:type="spellEnd"/>
       <w:r>
@@ -3600,6 +3696,7 @@
         </w:rPr>
         <w:t xml:space="preserve">    </w:t>
       </w:r>
+      <w:proofErr w:type="gramStart"/>
       <w:r>
         <w:rPr>
           <w:rFonts w:ascii="Consolas" w:eastAsia="Times New Roman" w:hAnsi="Consolas" w:cs="Times New Roman"/>
@@ -3610,6 +3707,7 @@
         </w:rPr>
         <w:t>restart</w:t>
       </w:r>
+      <w:proofErr w:type="gramEnd"/>
       <w:r>
         <w:rPr>
           <w:rFonts w:ascii="Consolas" w:eastAsia="Times New Roman" w:hAnsi="Consolas" w:cs="Times New Roman"/>
@@ -3774,6 +3872,7 @@
         </w:rPr>
         <w:t xml:space="preserve">    </w:t>
       </w:r>
+      <w:proofErr w:type="gramStart"/>
       <w:r>
         <w:rPr>
           <w:rFonts w:ascii="Consolas" w:eastAsia="Times New Roman" w:hAnsi="Consolas" w:cs="Times New Roman"/>
@@ -3784,6 +3883,7 @@
         </w:rPr>
         <w:t>networks</w:t>
       </w:r>
+      <w:proofErr w:type="gramEnd"/>
       <w:r>
         <w:rPr>
           <w:rFonts w:ascii="Consolas" w:eastAsia="Times New Roman" w:hAnsi="Consolas" w:cs="Times New Roman"/>
@@ -3883,6 +3983,7 @@
         </w:rPr>
         <w:t xml:space="preserve">    </w:t>
       </w:r>
+      <w:proofErr w:type="gramStart"/>
       <w:r>
         <w:rPr>
           <w:rFonts w:ascii="Consolas" w:eastAsia="Times New Roman" w:hAnsi="Consolas" w:cs="Times New Roman"/>
@@ -3893,6 +3994,7 @@
         </w:rPr>
         <w:t>volumes</w:t>
       </w:r>
+      <w:proofErr w:type="gramEnd"/>
       <w:r>
         <w:rPr>
           <w:rFonts w:ascii="Consolas" w:eastAsia="Times New Roman" w:hAnsi="Consolas" w:cs="Times New Roman"/>
@@ -4349,6 +4451,7 @@
         <w:t xml:space="preserve">  </w:t>
       </w:r>
       <w:proofErr w:type="spellStart"/>
+      <w:proofErr w:type="gramStart"/>
       <w:r>
         <w:rPr>
           <w:rFonts w:ascii="Consolas" w:eastAsia="Times New Roman" w:hAnsi="Consolas" w:cs="Times New Roman"/>
@@ -4360,6 +4463,7 @@
         <w:t>nextcloud</w:t>
       </w:r>
       <w:proofErr w:type="spellEnd"/>
+      <w:proofErr w:type="gramEnd"/>
       <w:r>
         <w:rPr>
           <w:rFonts w:ascii="Consolas" w:eastAsia="Times New Roman" w:hAnsi="Consolas" w:cs="Times New Roman"/>
@@ -4426,6 +4530,7 @@
         </w:rPr>
         <w:t xml:space="preserve">    </w:t>
       </w:r>
+      <w:proofErr w:type="gramStart"/>
       <w:r>
         <w:rPr>
           <w:rFonts w:ascii="Consolas" w:eastAsia="Times New Roman" w:hAnsi="Consolas" w:cs="Times New Roman"/>
@@ -4436,6 +4541,7 @@
         </w:rPr>
         <w:t>image</w:t>
       </w:r>
+      <w:proofErr w:type="gramEnd"/>
       <w:r>
         <w:rPr>
           <w:rFonts w:ascii="Consolas" w:eastAsia="Times New Roman" w:hAnsi="Consolas" w:cs="Times New Roman"/>
@@ -4515,6 +4621,7 @@
         <w:t xml:space="preserve">    </w:t>
       </w:r>
       <w:proofErr w:type="spellStart"/>
+      <w:proofErr w:type="gramStart"/>
       <w:r>
         <w:rPr>
           <w:rFonts w:ascii="Consolas" w:eastAsia="Times New Roman" w:hAnsi="Consolas" w:cs="Times New Roman"/>
@@ -4523,7 +4630,18 @@
           <w:szCs w:val="21"/>
           <w:lang w:val="fr-CA" w:eastAsia="fr-CA"/>
         </w:rPr>
-        <w:t>container_name</w:t>
+        <w:t>container</w:t>
+      </w:r>
+      <w:proofErr w:type="gramEnd"/>
+      <w:r>
+        <w:rPr>
+          <w:rFonts w:ascii="Consolas" w:eastAsia="Times New Roman" w:hAnsi="Consolas" w:cs="Times New Roman"/>
+          <w:color w:val="569CD6"/>
+          <w:sz w:val="21"/>
+          <w:szCs w:val="21"/>
+          <w:lang w:val="fr-CA" w:eastAsia="fr-CA"/>
+        </w:rPr>
+        <w:t>_name</w:t>
       </w:r>
       <w:proofErr w:type="spellEnd"/>
       <w:r>
@@ -4604,6 +4722,7 @@
         </w:rPr>
         <w:t xml:space="preserve">    </w:t>
       </w:r>
+      <w:proofErr w:type="gramStart"/>
       <w:r>
         <w:rPr>
           <w:rFonts w:ascii="Consolas" w:eastAsia="Times New Roman" w:hAnsi="Consolas" w:cs="Times New Roman"/>
@@ -4614,6 +4733,7 @@
         </w:rPr>
         <w:t>restart</w:t>
       </w:r>
+      <w:proofErr w:type="gramEnd"/>
       <w:r>
         <w:rPr>
           <w:rFonts w:ascii="Consolas" w:eastAsia="Times New Roman" w:hAnsi="Consolas" w:cs="Times New Roman"/>
@@ -4693,6 +4813,7 @@
         </w:rPr>
         <w:t xml:space="preserve">    </w:t>
       </w:r>
+      <w:proofErr w:type="gramStart"/>
       <w:r>
         <w:rPr>
           <w:rFonts w:ascii="Consolas" w:eastAsia="Times New Roman" w:hAnsi="Consolas" w:cs="Times New Roman"/>
@@ -4703,6 +4824,7 @@
         </w:rPr>
         <w:t>networks</w:t>
       </w:r>
+      <w:proofErr w:type="gramEnd"/>
       <w:r>
         <w:rPr>
           <w:rFonts w:ascii="Consolas" w:eastAsia="Times New Roman" w:hAnsi="Consolas" w:cs="Times New Roman"/>
@@ -4825,6 +4947,7 @@
         <w:t xml:space="preserve">    </w:t>
       </w:r>
       <w:proofErr w:type="spellStart"/>
+      <w:proofErr w:type="gramStart"/>
       <w:r>
         <w:rPr>
           <w:rFonts w:ascii="Consolas" w:eastAsia="Times New Roman" w:hAnsi="Consolas" w:cs="Times New Roman"/>
@@ -4833,7 +4956,18 @@
           <w:szCs w:val="21"/>
           <w:lang w:val="fr-CA" w:eastAsia="fr-CA"/>
         </w:rPr>
-        <w:t>depends_on</w:t>
+        <w:t>depends</w:t>
+      </w:r>
+      <w:proofErr w:type="gramEnd"/>
+      <w:r>
+        <w:rPr>
+          <w:rFonts w:ascii="Consolas" w:eastAsia="Times New Roman" w:hAnsi="Consolas" w:cs="Times New Roman"/>
+          <w:color w:val="569CD6"/>
+          <w:sz w:val="21"/>
+          <w:szCs w:val="21"/>
+          <w:lang w:val="fr-CA" w:eastAsia="fr-CA"/>
+        </w:rPr>
+        <w:t>_on</w:t>
       </w:r>
       <w:proofErr w:type="spellEnd"/>
       <w:r>
@@ -4937,6 +5071,7 @@
         </w:rPr>
         <w:t xml:space="preserve">    </w:t>
       </w:r>
+      <w:proofErr w:type="gramStart"/>
       <w:r>
         <w:rPr>
           <w:rFonts w:ascii="Consolas" w:eastAsia="Times New Roman" w:hAnsi="Consolas" w:cs="Times New Roman"/>
@@ -4947,6 +5082,7 @@
         </w:rPr>
         <w:t>ports</w:t>
       </w:r>
+      <w:proofErr w:type="gramEnd"/>
       <w:r>
         <w:rPr>
           <w:rFonts w:ascii="Consolas" w:eastAsia="Times New Roman" w:hAnsi="Consolas" w:cs="Times New Roman"/>
@@ -5046,6 +5182,7 @@
         </w:rPr>
         <w:t xml:space="preserve">    </w:t>
       </w:r>
+      <w:proofErr w:type="gramStart"/>
       <w:r>
         <w:rPr>
           <w:rFonts w:ascii="Consolas" w:eastAsia="Times New Roman" w:hAnsi="Consolas" w:cs="Times New Roman"/>
@@ -5056,6 +5193,7 @@
         </w:rPr>
         <w:t>volumes</w:t>
       </w:r>
+      <w:proofErr w:type="gramEnd"/>
       <w:r>
         <w:rPr>
           <w:rFonts w:ascii="Consolas" w:eastAsia="Times New Roman" w:hAnsi="Consolas" w:cs="Times New Roman"/>
@@ -5301,6 +5439,7 @@
         <w:t xml:space="preserve">    </w:t>
       </w:r>
       <w:proofErr w:type="spellStart"/>
+      <w:proofErr w:type="gramStart"/>
       <w:r>
         <w:rPr>
           <w:rFonts w:ascii="Consolas" w:eastAsia="Times New Roman" w:hAnsi="Consolas" w:cs="Times New Roman"/>
@@ -5312,6 +5451,7 @@
         <w:t>environment</w:t>
       </w:r>
       <w:proofErr w:type="spellEnd"/>
+      <w:proofErr w:type="gramEnd"/>
       <w:r>
         <w:rPr>
           <w:rFonts w:ascii="Consolas" w:eastAsia="Times New Roman" w:hAnsi="Consolas" w:cs="Times New Roman"/>
@@ -5659,7 +5799,29 @@
           <w:szCs w:val="21"/>
           <w:lang w:val="en-US" w:eastAsia="fr-CA"/>
         </w:rPr>
-        <w:t>'traefik.enable=true'</w:t>
+        <w:t>'</w:t>
+      </w:r>
+      <w:proofErr w:type="gramStart"/>
+      <w:r>
+        <w:rPr>
+          <w:rFonts w:ascii="Consolas" w:eastAsia="Times New Roman" w:hAnsi="Consolas" w:cs="Times New Roman"/>
+          <w:color w:val="CE9178"/>
+          <w:sz w:val="21"/>
+          <w:szCs w:val="21"/>
+          <w:lang w:val="en-US" w:eastAsia="fr-CA"/>
+        </w:rPr>
+        <w:t>traefik.enable</w:t>
+      </w:r>
+      <w:proofErr w:type="gramEnd"/>
+      <w:r>
+        <w:rPr>
+          <w:rFonts w:ascii="Consolas" w:eastAsia="Times New Roman" w:hAnsi="Consolas" w:cs="Times New Roman"/>
+          <w:color w:val="CE9178"/>
+          <w:sz w:val="21"/>
+          <w:szCs w:val="21"/>
+          <w:lang w:val="en-US" w:eastAsia="fr-CA"/>
+        </w:rPr>
+        <w:t>=true'</w:t>
       </w:r>
     </w:p>
     <w:p>
@@ -5692,7 +5854,29 @@
           <w:szCs w:val="21"/>
           <w:lang w:val="en-US" w:eastAsia="fr-CA"/>
         </w:rPr>
-        <w:t>'traefik.http.routers.nextcloud.rule=Host(`nextcloud.${MY_DOMAIN}`)'</w:t>
+        <w:t>'</w:t>
+      </w:r>
+      <w:proofErr w:type="gramStart"/>
+      <w:r>
+        <w:rPr>
+          <w:rFonts w:ascii="Consolas" w:eastAsia="Times New Roman" w:hAnsi="Consolas" w:cs="Times New Roman"/>
+          <w:color w:val="CE9178"/>
+          <w:sz w:val="21"/>
+          <w:szCs w:val="21"/>
+          <w:lang w:val="en-US" w:eastAsia="fr-CA"/>
+        </w:rPr>
+        <w:t>traefik.http</w:t>
+      </w:r>
+      <w:proofErr w:type="gramEnd"/>
+      <w:r>
+        <w:rPr>
+          <w:rFonts w:ascii="Consolas" w:eastAsia="Times New Roman" w:hAnsi="Consolas" w:cs="Times New Roman"/>
+          <w:color w:val="CE9178"/>
+          <w:sz w:val="21"/>
+          <w:szCs w:val="21"/>
+          <w:lang w:val="en-US" w:eastAsia="fr-CA"/>
+        </w:rPr>
+        <w:t>.routers.nextcloud.rule=Host(`nextcloud.${MY_DOMAIN}`)'</w:t>
       </w:r>
     </w:p>
     <w:p>
@@ -5725,7 +5909,29 @@
           <w:szCs w:val="21"/>
           <w:lang w:val="en-US" w:eastAsia="fr-CA"/>
         </w:rPr>
-        <w:t>'traefik.http.routers.nextcloud.entryPoints=websecure'</w:t>
+        <w:t>'</w:t>
+      </w:r>
+      <w:proofErr w:type="gramStart"/>
+      <w:r>
+        <w:rPr>
+          <w:rFonts w:ascii="Consolas" w:eastAsia="Times New Roman" w:hAnsi="Consolas" w:cs="Times New Roman"/>
+          <w:color w:val="CE9178"/>
+          <w:sz w:val="21"/>
+          <w:szCs w:val="21"/>
+          <w:lang w:val="en-US" w:eastAsia="fr-CA"/>
+        </w:rPr>
+        <w:t>traefik.http</w:t>
+      </w:r>
+      <w:proofErr w:type="gramEnd"/>
+      <w:r>
+        <w:rPr>
+          <w:rFonts w:ascii="Consolas" w:eastAsia="Times New Roman" w:hAnsi="Consolas" w:cs="Times New Roman"/>
+          <w:color w:val="CE9178"/>
+          <w:sz w:val="21"/>
+          <w:szCs w:val="21"/>
+          <w:lang w:val="en-US" w:eastAsia="fr-CA"/>
+        </w:rPr>
+        <w:t>.routers.nextcloud.entryPoints=websecure'</w:t>
       </w:r>
     </w:p>
     <w:p>
@@ -5797,6 +6003,7 @@
         <w:t xml:space="preserve">  </w:t>
       </w:r>
       <w:proofErr w:type="spellStart"/>
+      <w:proofErr w:type="gramStart"/>
       <w:r>
         <w:rPr>
           <w:rFonts w:ascii="Consolas" w:eastAsia="Times New Roman" w:hAnsi="Consolas" w:cs="Times New Roman"/>
@@ -5808,6 +6015,7 @@
         <w:t>jellyfin</w:t>
       </w:r>
       <w:proofErr w:type="spellEnd"/>
+      <w:proofErr w:type="gramEnd"/>
       <w:r>
         <w:rPr>
           <w:rFonts w:ascii="Consolas" w:eastAsia="Times New Roman" w:hAnsi="Consolas" w:cs="Times New Roman"/>
@@ -5874,6 +6082,7 @@
         </w:rPr>
         <w:t xml:space="preserve">    </w:t>
       </w:r>
+      <w:proofErr w:type="gramStart"/>
       <w:r>
         <w:rPr>
           <w:rFonts w:ascii="Consolas" w:eastAsia="Times New Roman" w:hAnsi="Consolas" w:cs="Times New Roman"/>
@@ -5884,6 +6093,7 @@
         </w:rPr>
         <w:t>image</w:t>
       </w:r>
+      <w:proofErr w:type="gramEnd"/>
       <w:r>
         <w:rPr>
           <w:rFonts w:ascii="Consolas" w:eastAsia="Times New Roman" w:hAnsi="Consolas" w:cs="Times New Roman"/>
@@ -5985,6 +6195,7 @@
         <w:t xml:space="preserve">    </w:t>
       </w:r>
       <w:proofErr w:type="spellStart"/>
+      <w:proofErr w:type="gramStart"/>
       <w:r>
         <w:rPr>
           <w:rFonts w:ascii="Consolas" w:eastAsia="Times New Roman" w:hAnsi="Consolas" w:cs="Times New Roman"/>
@@ -5993,7 +6204,18 @@
           <w:szCs w:val="21"/>
           <w:lang w:val="fr-CA" w:eastAsia="fr-CA"/>
         </w:rPr>
-        <w:t>container_name</w:t>
+        <w:t>container</w:t>
+      </w:r>
+      <w:proofErr w:type="gramEnd"/>
+      <w:r>
+        <w:rPr>
+          <w:rFonts w:ascii="Consolas" w:eastAsia="Times New Roman" w:hAnsi="Consolas" w:cs="Times New Roman"/>
+          <w:color w:val="569CD6"/>
+          <w:sz w:val="21"/>
+          <w:szCs w:val="21"/>
+          <w:lang w:val="fr-CA" w:eastAsia="fr-CA"/>
+        </w:rPr>
+        <w:t>_name</w:t>
       </w:r>
       <w:proofErr w:type="spellEnd"/>
       <w:r>
@@ -6074,6 +6296,7 @@
         </w:rPr>
         <w:t xml:space="preserve">    </w:t>
       </w:r>
+      <w:proofErr w:type="gramStart"/>
       <w:r>
         <w:rPr>
           <w:rFonts w:ascii="Consolas" w:eastAsia="Times New Roman" w:hAnsi="Consolas" w:cs="Times New Roman"/>
@@ -6084,6 +6307,7 @@
         </w:rPr>
         <w:t>restart</w:t>
       </w:r>
+      <w:proofErr w:type="gramEnd"/>
       <w:r>
         <w:rPr>
           <w:rFonts w:ascii="Consolas" w:eastAsia="Times New Roman" w:hAnsi="Consolas" w:cs="Times New Roman"/>
@@ -6162,6 +6386,7 @@
         </w:rPr>
         <w:t xml:space="preserve">    </w:t>
       </w:r>
+      <w:proofErr w:type="gramStart"/>
       <w:r>
         <w:rPr>
           <w:rFonts w:ascii="Consolas" w:eastAsia="Times New Roman" w:hAnsi="Consolas" w:cs="Times New Roman"/>
@@ -6172,6 +6397,7 @@
         </w:rPr>
         <w:t>networks</w:t>
       </w:r>
+      <w:proofErr w:type="gramEnd"/>
       <w:r>
         <w:rPr>
           <w:rFonts w:ascii="Consolas" w:eastAsia="Times New Roman" w:hAnsi="Consolas" w:cs="Times New Roman"/>
@@ -6271,6 +6497,7 @@
         </w:rPr>
         <w:t xml:space="preserve">    </w:t>
       </w:r>
+      <w:proofErr w:type="gramStart"/>
       <w:r>
         <w:rPr>
           <w:rFonts w:ascii="Consolas" w:eastAsia="Times New Roman" w:hAnsi="Consolas" w:cs="Times New Roman"/>
@@ -6281,6 +6508,7 @@
         </w:rPr>
         <w:t>ports</w:t>
       </w:r>
+      <w:proofErr w:type="gramEnd"/>
       <w:r>
         <w:rPr>
           <w:rFonts w:ascii="Consolas" w:eastAsia="Times New Roman" w:hAnsi="Consolas" w:cs="Times New Roman"/>
@@ -6393,6 +6621,7 @@
         <w:t xml:space="preserve">    </w:t>
       </w:r>
       <w:proofErr w:type="spellStart"/>
+      <w:proofErr w:type="gramStart"/>
       <w:r>
         <w:rPr>
           <w:rFonts w:ascii="Consolas" w:eastAsia="Times New Roman" w:hAnsi="Consolas" w:cs="Times New Roman"/>
@@ -6404,6 +6633,7 @@
         <w:t>environment</w:t>
       </w:r>
       <w:proofErr w:type="spellEnd"/>
+      <w:proofErr w:type="gramEnd"/>
       <w:r>
         <w:rPr>
           <w:rFonts w:ascii="Consolas" w:eastAsia="Times New Roman" w:hAnsi="Consolas" w:cs="Times New Roman"/>
@@ -6774,7 +7004,29 @@
           <w:szCs w:val="21"/>
           <w:lang w:val="en-US" w:eastAsia="fr-CA"/>
         </w:rPr>
-        <w:t>'traefik.enable=true'</w:t>
+        <w:t>'</w:t>
+      </w:r>
+      <w:proofErr w:type="gramStart"/>
+      <w:r>
+        <w:rPr>
+          <w:rFonts w:ascii="Consolas" w:eastAsia="Times New Roman" w:hAnsi="Consolas" w:cs="Times New Roman"/>
+          <w:color w:val="CE9178"/>
+          <w:sz w:val="21"/>
+          <w:szCs w:val="21"/>
+          <w:lang w:val="en-US" w:eastAsia="fr-CA"/>
+        </w:rPr>
+        <w:t>traefik.enable</w:t>
+      </w:r>
+      <w:proofErr w:type="gramEnd"/>
+      <w:r>
+        <w:rPr>
+          <w:rFonts w:ascii="Consolas" w:eastAsia="Times New Roman" w:hAnsi="Consolas" w:cs="Times New Roman"/>
+          <w:color w:val="CE9178"/>
+          <w:sz w:val="21"/>
+          <w:szCs w:val="21"/>
+          <w:lang w:val="en-US" w:eastAsia="fr-CA"/>
+        </w:rPr>
+        <w:t>=true'</w:t>
       </w:r>
     </w:p>
     <w:p>
@@ -6807,7 +7059,29 @@
           <w:szCs w:val="21"/>
           <w:lang w:val="en-US" w:eastAsia="fr-CA"/>
         </w:rPr>
-        <w:t>'traefik.http.routers.jellyfin.rule=Host(`jellyfin.${MY_DOMAIN}`)'</w:t>
+        <w:t>'</w:t>
+      </w:r>
+      <w:proofErr w:type="gramStart"/>
+      <w:r>
+        <w:rPr>
+          <w:rFonts w:ascii="Consolas" w:eastAsia="Times New Roman" w:hAnsi="Consolas" w:cs="Times New Roman"/>
+          <w:color w:val="CE9178"/>
+          <w:sz w:val="21"/>
+          <w:szCs w:val="21"/>
+          <w:lang w:val="en-US" w:eastAsia="fr-CA"/>
+        </w:rPr>
+        <w:t>traefik.http</w:t>
+      </w:r>
+      <w:proofErr w:type="gramEnd"/>
+      <w:r>
+        <w:rPr>
+          <w:rFonts w:ascii="Consolas" w:eastAsia="Times New Roman" w:hAnsi="Consolas" w:cs="Times New Roman"/>
+          <w:color w:val="CE9178"/>
+          <w:sz w:val="21"/>
+          <w:szCs w:val="21"/>
+          <w:lang w:val="en-US" w:eastAsia="fr-CA"/>
+        </w:rPr>
+        <w:t>.routers.jellyfin.rule=Host(`jellyfin.${MY_DOMAIN}`)'</w:t>
       </w:r>
     </w:p>
     <w:p>
@@ -6840,7 +7114,29 @@
           <w:szCs w:val="21"/>
           <w:lang w:val="en-US" w:eastAsia="fr-CA"/>
         </w:rPr>
-        <w:t>'traefik.http.routers.jellyfin.entryPoints=websecure'</w:t>
+        <w:t>'</w:t>
+      </w:r>
+      <w:proofErr w:type="gramStart"/>
+      <w:r>
+        <w:rPr>
+          <w:rFonts w:ascii="Consolas" w:eastAsia="Times New Roman" w:hAnsi="Consolas" w:cs="Times New Roman"/>
+          <w:color w:val="CE9178"/>
+          <w:sz w:val="21"/>
+          <w:szCs w:val="21"/>
+          <w:lang w:val="en-US" w:eastAsia="fr-CA"/>
+        </w:rPr>
+        <w:t>traefik.http</w:t>
+      </w:r>
+      <w:proofErr w:type="gramEnd"/>
+      <w:r>
+        <w:rPr>
+          <w:rFonts w:ascii="Consolas" w:eastAsia="Times New Roman" w:hAnsi="Consolas" w:cs="Times New Roman"/>
+          <w:color w:val="CE9178"/>
+          <w:sz w:val="21"/>
+          <w:szCs w:val="21"/>
+          <w:lang w:val="en-US" w:eastAsia="fr-CA"/>
+        </w:rPr>
+        <w:t>.routers.jellyfin.entryPoints=websecure'</w:t>
       </w:r>
     </w:p>
     <w:p>
@@ -6911,6 +7207,7 @@
         </w:rPr>
         <w:t xml:space="preserve">  </w:t>
       </w:r>
+      <w:proofErr w:type="gramStart"/>
       <w:r>
         <w:rPr>
           <w:rFonts w:ascii="Consolas" w:eastAsia="Times New Roman" w:hAnsi="Consolas" w:cs="Times New Roman"/>
@@ -6921,6 +7218,7 @@
         </w:rPr>
         <w:t>proxy</w:t>
       </w:r>
+      <w:proofErr w:type="gramEnd"/>
       <w:r>
         <w:rPr>
           <w:rFonts w:ascii="Consolas" w:eastAsia="Times New Roman" w:hAnsi="Consolas" w:cs="Times New Roman"/>
@@ -6987,6 +7285,7 @@
         </w:rPr>
         <w:t xml:space="preserve">    </w:t>
       </w:r>
+      <w:proofErr w:type="gramStart"/>
       <w:r>
         <w:rPr>
           <w:rFonts w:ascii="Consolas" w:eastAsia="Times New Roman" w:hAnsi="Consolas" w:cs="Times New Roman"/>
@@ -6997,6 +7296,7 @@
         </w:rPr>
         <w:t>image</w:t>
       </w:r>
+      <w:proofErr w:type="gramEnd"/>
       <w:r>
         <w:rPr>
           <w:rFonts w:ascii="Consolas" w:eastAsia="Times New Roman" w:hAnsi="Consolas" w:cs="Times New Roman"/>
@@ -7076,6 +7376,7 @@
         <w:t xml:space="preserve">    </w:t>
       </w:r>
       <w:proofErr w:type="spellStart"/>
+      <w:proofErr w:type="gramStart"/>
       <w:r>
         <w:rPr>
           <w:rFonts w:ascii="Consolas" w:eastAsia="Times New Roman" w:hAnsi="Consolas" w:cs="Times New Roman"/>
@@ -7084,7 +7385,18 @@
           <w:szCs w:val="21"/>
           <w:lang w:val="fr-CA" w:eastAsia="fr-CA"/>
         </w:rPr>
-        <w:t>container_name</w:t>
+        <w:t>container</w:t>
+      </w:r>
+      <w:proofErr w:type="gramEnd"/>
+      <w:r>
+        <w:rPr>
+          <w:rFonts w:ascii="Consolas" w:eastAsia="Times New Roman" w:hAnsi="Consolas" w:cs="Times New Roman"/>
+          <w:color w:val="569CD6"/>
+          <w:sz w:val="21"/>
+          <w:szCs w:val="21"/>
+          <w:lang w:val="fr-CA" w:eastAsia="fr-CA"/>
+        </w:rPr>
+        <w:t>_name</w:t>
       </w:r>
       <w:proofErr w:type="spellEnd"/>
       <w:r>
@@ -7165,6 +7477,7 @@
         </w:rPr>
         <w:t xml:space="preserve">    </w:t>
       </w:r>
+      <w:proofErr w:type="gramStart"/>
       <w:r>
         <w:rPr>
           <w:rFonts w:ascii="Consolas" w:eastAsia="Times New Roman" w:hAnsi="Consolas" w:cs="Times New Roman"/>
@@ -7175,6 +7488,7 @@
         </w:rPr>
         <w:t>restart</w:t>
       </w:r>
+      <w:proofErr w:type="gramEnd"/>
       <w:r>
         <w:rPr>
           <w:rFonts w:ascii="Consolas" w:eastAsia="Times New Roman" w:hAnsi="Consolas" w:cs="Times New Roman"/>
@@ -7253,6 +7567,7 @@
         </w:rPr>
         <w:t xml:space="preserve">    </w:t>
       </w:r>
+      <w:proofErr w:type="gramStart"/>
       <w:r>
         <w:rPr>
           <w:rFonts w:ascii="Consolas" w:eastAsia="Times New Roman" w:hAnsi="Consolas" w:cs="Times New Roman"/>
@@ -7263,6 +7578,7 @@
         </w:rPr>
         <w:t>networks</w:t>
       </w:r>
+      <w:proofErr w:type="gramEnd"/>
       <w:r>
         <w:rPr>
           <w:rFonts w:ascii="Consolas" w:eastAsia="Times New Roman" w:hAnsi="Consolas" w:cs="Times New Roman"/>
@@ -7435,7 +7751,29 @@
           <w:szCs w:val="21"/>
           <w:lang w:val="en-US" w:eastAsia="fr-CA"/>
         </w:rPr>
-        <w:t>"--log.level=DEBUG"</w:t>
+        <w:t>"--</w:t>
+      </w:r>
+      <w:proofErr w:type="gramStart"/>
+      <w:r>
+        <w:rPr>
+          <w:rFonts w:ascii="Consolas" w:eastAsia="Times New Roman" w:hAnsi="Consolas" w:cs="Times New Roman"/>
+          <w:color w:val="CE9178"/>
+          <w:sz w:val="21"/>
+          <w:szCs w:val="21"/>
+          <w:lang w:val="en-US" w:eastAsia="fr-CA"/>
+        </w:rPr>
+        <w:t>log.level</w:t>
+      </w:r>
+      <w:proofErr w:type="gramEnd"/>
+      <w:r>
+        <w:rPr>
+          <w:rFonts w:ascii="Consolas" w:eastAsia="Times New Roman" w:hAnsi="Consolas" w:cs="Times New Roman"/>
+          <w:color w:val="CE9178"/>
+          <w:sz w:val="21"/>
+          <w:szCs w:val="21"/>
+          <w:lang w:val="en-US" w:eastAsia="fr-CA"/>
+        </w:rPr>
+        <w:t>=DEBUG"</w:t>
       </w:r>
     </w:p>
     <w:p>
@@ -7468,7 +7806,29 @@
           <w:szCs w:val="21"/>
           <w:lang w:val="en-US" w:eastAsia="fr-CA"/>
         </w:rPr>
-        <w:t>"--api.insecure=true"</w:t>
+        <w:t>"--</w:t>
+      </w:r>
+      <w:proofErr w:type="gramStart"/>
+      <w:r>
+        <w:rPr>
+          <w:rFonts w:ascii="Consolas" w:eastAsia="Times New Roman" w:hAnsi="Consolas" w:cs="Times New Roman"/>
+          <w:color w:val="CE9178"/>
+          <w:sz w:val="21"/>
+          <w:szCs w:val="21"/>
+          <w:lang w:val="en-US" w:eastAsia="fr-CA"/>
+        </w:rPr>
+        <w:t>api.insecure</w:t>
+      </w:r>
+      <w:proofErr w:type="gramEnd"/>
+      <w:r>
+        <w:rPr>
+          <w:rFonts w:ascii="Consolas" w:eastAsia="Times New Roman" w:hAnsi="Consolas" w:cs="Times New Roman"/>
+          <w:color w:val="CE9178"/>
+          <w:sz w:val="21"/>
+          <w:szCs w:val="21"/>
+          <w:lang w:val="en-US" w:eastAsia="fr-CA"/>
+        </w:rPr>
+        <w:t>=true"</w:t>
       </w:r>
     </w:p>
     <w:p>
@@ -7501,7 +7861,29 @@
           <w:szCs w:val="21"/>
           <w:lang w:val="en-US" w:eastAsia="fr-CA"/>
         </w:rPr>
-        <w:t>"--providers.docker=true"</w:t>
+        <w:t>"--</w:t>
+      </w:r>
+      <w:proofErr w:type="gramStart"/>
+      <w:r>
+        <w:rPr>
+          <w:rFonts w:ascii="Consolas" w:eastAsia="Times New Roman" w:hAnsi="Consolas" w:cs="Times New Roman"/>
+          <w:color w:val="CE9178"/>
+          <w:sz w:val="21"/>
+          <w:szCs w:val="21"/>
+          <w:lang w:val="en-US" w:eastAsia="fr-CA"/>
+        </w:rPr>
+        <w:t>providers.docker</w:t>
+      </w:r>
+      <w:proofErr w:type="gramEnd"/>
+      <w:r>
+        <w:rPr>
+          <w:rFonts w:ascii="Consolas" w:eastAsia="Times New Roman" w:hAnsi="Consolas" w:cs="Times New Roman"/>
+          <w:color w:val="CE9178"/>
+          <w:sz w:val="21"/>
+          <w:szCs w:val="21"/>
+          <w:lang w:val="en-US" w:eastAsia="fr-CA"/>
+        </w:rPr>
+        <w:t>=true"</w:t>
       </w:r>
     </w:p>
     <w:p>
@@ -7534,7 +7916,29 @@
           <w:szCs w:val="21"/>
           <w:lang w:val="en-US" w:eastAsia="fr-CA"/>
         </w:rPr>
-        <w:t>"--providers.docker.exposedbydefault=false"</w:t>
+        <w:t>"--</w:t>
+      </w:r>
+      <w:proofErr w:type="gramStart"/>
+      <w:r>
+        <w:rPr>
+          <w:rFonts w:ascii="Consolas" w:eastAsia="Times New Roman" w:hAnsi="Consolas" w:cs="Times New Roman"/>
+          <w:color w:val="CE9178"/>
+          <w:sz w:val="21"/>
+          <w:szCs w:val="21"/>
+          <w:lang w:val="en-US" w:eastAsia="fr-CA"/>
+        </w:rPr>
+        <w:t>providers.docker</w:t>
+      </w:r>
+      <w:proofErr w:type="gramEnd"/>
+      <w:r>
+        <w:rPr>
+          <w:rFonts w:ascii="Consolas" w:eastAsia="Times New Roman" w:hAnsi="Consolas" w:cs="Times New Roman"/>
+          <w:color w:val="CE9178"/>
+          <w:sz w:val="21"/>
+          <w:szCs w:val="21"/>
+          <w:lang w:val="en-US" w:eastAsia="fr-CA"/>
+        </w:rPr>
+        <w:t>.exposedbydefault=false"</w:t>
       </w:r>
     </w:p>
     <w:p>
@@ -7567,7 +7971,29 @@
           <w:szCs w:val="21"/>
           <w:lang w:val="en-US" w:eastAsia="fr-CA"/>
         </w:rPr>
-        <w:t>"--certificatesresolvers.letsencrypt.acme.dnschallenge=true"</w:t>
+        <w:t>"--</w:t>
+      </w:r>
+      <w:proofErr w:type="gramStart"/>
+      <w:r>
+        <w:rPr>
+          <w:rFonts w:ascii="Consolas" w:eastAsia="Times New Roman" w:hAnsi="Consolas" w:cs="Times New Roman"/>
+          <w:color w:val="CE9178"/>
+          <w:sz w:val="21"/>
+          <w:szCs w:val="21"/>
+          <w:lang w:val="en-US" w:eastAsia="fr-CA"/>
+        </w:rPr>
+        <w:t>certificatesresolvers.letsencrypt</w:t>
+      </w:r>
+      <w:proofErr w:type="gramEnd"/>
+      <w:r>
+        <w:rPr>
+          <w:rFonts w:ascii="Consolas" w:eastAsia="Times New Roman" w:hAnsi="Consolas" w:cs="Times New Roman"/>
+          <w:color w:val="CE9178"/>
+          <w:sz w:val="21"/>
+          <w:szCs w:val="21"/>
+          <w:lang w:val="en-US" w:eastAsia="fr-CA"/>
+        </w:rPr>
+        <w:t>.acme.dnschallenge=true"</w:t>
       </w:r>
     </w:p>
     <w:p>
@@ -7600,7 +8026,29 @@
           <w:szCs w:val="21"/>
           <w:lang w:val="en-US" w:eastAsia="fr-CA"/>
         </w:rPr>
-        <w:t>"--certificatesresolvers.letsencrypt.acme.dnschallenge.provider=duckdns"</w:t>
+        <w:t>"--</w:t>
+      </w:r>
+      <w:proofErr w:type="gramStart"/>
+      <w:r>
+        <w:rPr>
+          <w:rFonts w:ascii="Consolas" w:eastAsia="Times New Roman" w:hAnsi="Consolas" w:cs="Times New Roman"/>
+          <w:color w:val="CE9178"/>
+          <w:sz w:val="21"/>
+          <w:szCs w:val="21"/>
+          <w:lang w:val="en-US" w:eastAsia="fr-CA"/>
+        </w:rPr>
+        <w:t>certificatesresolvers.letsencrypt</w:t>
+      </w:r>
+      <w:proofErr w:type="gramEnd"/>
+      <w:r>
+        <w:rPr>
+          <w:rFonts w:ascii="Consolas" w:eastAsia="Times New Roman" w:hAnsi="Consolas" w:cs="Times New Roman"/>
+          <w:color w:val="CE9178"/>
+          <w:sz w:val="21"/>
+          <w:szCs w:val="21"/>
+          <w:lang w:val="en-US" w:eastAsia="fr-CA"/>
+        </w:rPr>
+        <w:t>.acme.dnschallenge.provider=duckdns"</w:t>
       </w:r>
     </w:p>
     <w:p>
@@ -7666,7 +8114,29 @@
           <w:szCs w:val="21"/>
           <w:lang w:val="en-US" w:eastAsia="fr-CA"/>
         </w:rPr>
-        <w:t>"--certificatesresolvers.letsencrypt.acme.dnschallenge.disablePropagationCheck=true"</w:t>
+        <w:t>"--</w:t>
+      </w:r>
+      <w:proofErr w:type="gramStart"/>
+      <w:r>
+        <w:rPr>
+          <w:rFonts w:ascii="Consolas" w:eastAsia="Times New Roman" w:hAnsi="Consolas" w:cs="Times New Roman"/>
+          <w:color w:val="CE9178"/>
+          <w:sz w:val="21"/>
+          <w:szCs w:val="21"/>
+          <w:lang w:val="en-US" w:eastAsia="fr-CA"/>
+        </w:rPr>
+        <w:t>certificatesresolvers.letsencrypt</w:t>
+      </w:r>
+      <w:proofErr w:type="gramEnd"/>
+      <w:r>
+        <w:rPr>
+          <w:rFonts w:ascii="Consolas" w:eastAsia="Times New Roman" w:hAnsi="Consolas" w:cs="Times New Roman"/>
+          <w:color w:val="CE9178"/>
+          <w:sz w:val="21"/>
+          <w:szCs w:val="21"/>
+          <w:lang w:val="en-US" w:eastAsia="fr-CA"/>
+        </w:rPr>
+        <w:t>.acme.dnschallenge.disablePropagationCheck=true"</w:t>
       </w:r>
     </w:p>
     <w:p>
@@ -7699,7 +8169,29 @@
           <w:szCs w:val="21"/>
           <w:lang w:val="en-US" w:eastAsia="fr-CA"/>
         </w:rPr>
-        <w:t>"--certificatesresolvers.letsencrypt.acme.dnschallenge.resolvers=1.1.1.1:53,8.8.8.8:53"</w:t>
+        <w:t>"--</w:t>
+      </w:r>
+      <w:proofErr w:type="gramStart"/>
+      <w:r>
+        <w:rPr>
+          <w:rFonts w:ascii="Consolas" w:eastAsia="Times New Roman" w:hAnsi="Consolas" w:cs="Times New Roman"/>
+          <w:color w:val="CE9178"/>
+          <w:sz w:val="21"/>
+          <w:szCs w:val="21"/>
+          <w:lang w:val="en-US" w:eastAsia="fr-CA"/>
+        </w:rPr>
+        <w:t>certificatesresolvers.letsencrypt</w:t>
+      </w:r>
+      <w:proofErr w:type="gramEnd"/>
+      <w:r>
+        <w:rPr>
+          <w:rFonts w:ascii="Consolas" w:eastAsia="Times New Roman" w:hAnsi="Consolas" w:cs="Times New Roman"/>
+          <w:color w:val="CE9178"/>
+          <w:sz w:val="21"/>
+          <w:szCs w:val="21"/>
+          <w:lang w:val="en-US" w:eastAsia="fr-CA"/>
+        </w:rPr>
+        <w:t>.acme.dnschallenge.resolvers=1.1.1.1:53,8.8.8.8:53"</w:t>
       </w:r>
     </w:p>
     <w:p>
@@ -7732,7 +8224,29 @@
           <w:szCs w:val="21"/>
           <w:lang w:val="en-US" w:eastAsia="fr-CA"/>
         </w:rPr>
-        <w:t>"--certificatesresolvers.letsencrypt.acme.storage=/letsencrypt/acme.json"</w:t>
+        <w:t>"--</w:t>
+      </w:r>
+      <w:proofErr w:type="gramStart"/>
+      <w:r>
+        <w:rPr>
+          <w:rFonts w:ascii="Consolas" w:eastAsia="Times New Roman" w:hAnsi="Consolas" w:cs="Times New Roman"/>
+          <w:color w:val="CE9178"/>
+          <w:sz w:val="21"/>
+          <w:szCs w:val="21"/>
+          <w:lang w:val="en-US" w:eastAsia="fr-CA"/>
+        </w:rPr>
+        <w:t>certificatesresolvers.letsencrypt</w:t>
+      </w:r>
+      <w:proofErr w:type="gramEnd"/>
+      <w:r>
+        <w:rPr>
+          <w:rFonts w:ascii="Consolas" w:eastAsia="Times New Roman" w:hAnsi="Consolas" w:cs="Times New Roman"/>
+          <w:color w:val="CE9178"/>
+          <w:sz w:val="21"/>
+          <w:szCs w:val="21"/>
+          <w:lang w:val="en-US" w:eastAsia="fr-CA"/>
+        </w:rPr>
+        <w:t>.acme.storage=/letsencrypt/acme.json"</w:t>
       </w:r>
     </w:p>
     <w:p>
@@ -7765,7 +8279,29 @@
           <w:szCs w:val="21"/>
           <w:lang w:val="en-US" w:eastAsia="fr-CA"/>
         </w:rPr>
-        <w:t>"--entrypoints.web.address=:80"</w:t>
+        <w:t>"</w:t>
+      </w:r>
+      <w:proofErr w:type="gramStart"/>
+      <w:r>
+        <w:rPr>
+          <w:rFonts w:ascii="Consolas" w:eastAsia="Times New Roman" w:hAnsi="Consolas" w:cs="Times New Roman"/>
+          <w:color w:val="CE9178"/>
+          <w:sz w:val="21"/>
+          <w:szCs w:val="21"/>
+          <w:lang w:val="en-US" w:eastAsia="fr-CA"/>
+        </w:rPr>
+        <w:t>--entrypoints.web.address</w:t>
+      </w:r>
+      <w:proofErr w:type="gramEnd"/>
+      <w:r>
+        <w:rPr>
+          <w:rFonts w:ascii="Consolas" w:eastAsia="Times New Roman" w:hAnsi="Consolas" w:cs="Times New Roman"/>
+          <w:color w:val="CE9178"/>
+          <w:sz w:val="21"/>
+          <w:szCs w:val="21"/>
+          <w:lang w:val="en-US" w:eastAsia="fr-CA"/>
+        </w:rPr>
+        <w:t>=:80"</w:t>
       </w:r>
     </w:p>
     <w:p>
@@ -7798,7 +8334,29 @@
           <w:szCs w:val="21"/>
           <w:lang w:val="en-US" w:eastAsia="fr-CA"/>
         </w:rPr>
-        <w:t>"--entrypoints.web.http.redirections.entrypoint.to=websecure"</w:t>
+        <w:t>"</w:t>
+      </w:r>
+      <w:proofErr w:type="gramStart"/>
+      <w:r>
+        <w:rPr>
+          <w:rFonts w:ascii="Consolas" w:eastAsia="Times New Roman" w:hAnsi="Consolas" w:cs="Times New Roman"/>
+          <w:color w:val="CE9178"/>
+          <w:sz w:val="21"/>
+          <w:szCs w:val="21"/>
+          <w:lang w:val="en-US" w:eastAsia="fr-CA"/>
+        </w:rPr>
+        <w:t>--entrypoints.web.http.redirections.entrypoint.to</w:t>
+      </w:r>
+      <w:proofErr w:type="gramEnd"/>
+      <w:r>
+        <w:rPr>
+          <w:rFonts w:ascii="Consolas" w:eastAsia="Times New Roman" w:hAnsi="Consolas" w:cs="Times New Roman"/>
+          <w:color w:val="CE9178"/>
+          <w:sz w:val="21"/>
+          <w:szCs w:val="21"/>
+          <w:lang w:val="en-US" w:eastAsia="fr-CA"/>
+        </w:rPr>
+        <w:t>=websecure"</w:t>
       </w:r>
     </w:p>
     <w:p>
@@ -7831,7 +8389,29 @@
           <w:szCs w:val="21"/>
           <w:lang w:val="en-US" w:eastAsia="fr-CA"/>
         </w:rPr>
-        <w:t>"--entrypoints.web.http.redirections.entrypoint.scheme=https"</w:t>
+        <w:t>"</w:t>
+      </w:r>
+      <w:proofErr w:type="gramStart"/>
+      <w:r>
+        <w:rPr>
+          <w:rFonts w:ascii="Consolas" w:eastAsia="Times New Roman" w:hAnsi="Consolas" w:cs="Times New Roman"/>
+          <w:color w:val="CE9178"/>
+          <w:sz w:val="21"/>
+          <w:szCs w:val="21"/>
+          <w:lang w:val="en-US" w:eastAsia="fr-CA"/>
+        </w:rPr>
+        <w:t>--entrypoints.web.http</w:t>
+      </w:r>
+      <w:proofErr w:type="gramEnd"/>
+      <w:r>
+        <w:rPr>
+          <w:rFonts w:ascii="Consolas" w:eastAsia="Times New Roman" w:hAnsi="Consolas" w:cs="Times New Roman"/>
+          <w:color w:val="CE9178"/>
+          <w:sz w:val="21"/>
+          <w:szCs w:val="21"/>
+          <w:lang w:val="en-US" w:eastAsia="fr-CA"/>
+        </w:rPr>
+        <w:t>.redirections.entrypoint.scheme=https"</w:t>
       </w:r>
     </w:p>
     <w:p>
@@ -7864,7 +8444,29 @@
           <w:szCs w:val="21"/>
           <w:lang w:val="en-US" w:eastAsia="fr-CA"/>
         </w:rPr>
-        <w:t>"--entrypoints.websecure.address=:443"</w:t>
+        <w:t>"--</w:t>
+      </w:r>
+      <w:proofErr w:type="gramStart"/>
+      <w:r>
+        <w:rPr>
+          <w:rFonts w:ascii="Consolas" w:eastAsia="Times New Roman" w:hAnsi="Consolas" w:cs="Times New Roman"/>
+          <w:color w:val="CE9178"/>
+          <w:sz w:val="21"/>
+          <w:szCs w:val="21"/>
+          <w:lang w:val="en-US" w:eastAsia="fr-CA"/>
+        </w:rPr>
+        <w:t>entrypoints.websecure</w:t>
+      </w:r>
+      <w:proofErr w:type="gramEnd"/>
+      <w:r>
+        <w:rPr>
+          <w:rFonts w:ascii="Consolas" w:eastAsia="Times New Roman" w:hAnsi="Consolas" w:cs="Times New Roman"/>
+          <w:color w:val="CE9178"/>
+          <w:sz w:val="21"/>
+          <w:szCs w:val="21"/>
+          <w:lang w:val="en-US" w:eastAsia="fr-CA"/>
+        </w:rPr>
+        <w:t>.address=:443"</w:t>
       </w:r>
     </w:p>
     <w:p>
@@ -7930,7 +8532,29 @@
           <w:szCs w:val="21"/>
           <w:lang w:val="en-US" w:eastAsia="fr-CA"/>
         </w:rPr>
-        <w:t>"--entrypoints.websecure.http.tls.certResolver=letsencrypt"</w:t>
+        <w:t>"</w:t>
+      </w:r>
+      <w:proofErr w:type="gramStart"/>
+      <w:r>
+        <w:rPr>
+          <w:rFonts w:ascii="Consolas" w:eastAsia="Times New Roman" w:hAnsi="Consolas" w:cs="Times New Roman"/>
+          <w:color w:val="CE9178"/>
+          <w:sz w:val="21"/>
+          <w:szCs w:val="21"/>
+          <w:lang w:val="en-US" w:eastAsia="fr-CA"/>
+        </w:rPr>
+        <w:t>--entrypoints.websecure.http.tls.certResolver</w:t>
+      </w:r>
+      <w:proofErr w:type="gramEnd"/>
+      <w:r>
+        <w:rPr>
+          <w:rFonts w:ascii="Consolas" w:eastAsia="Times New Roman" w:hAnsi="Consolas" w:cs="Times New Roman"/>
+          <w:color w:val="CE9178"/>
+          <w:sz w:val="21"/>
+          <w:szCs w:val="21"/>
+          <w:lang w:val="en-US" w:eastAsia="fr-CA"/>
+        </w:rPr>
+        <w:t>=letsencrypt"</w:t>
       </w:r>
     </w:p>
     <w:p>
@@ -7963,7 +8587,29 @@
           <w:szCs w:val="21"/>
           <w:lang w:val="en-US" w:eastAsia="fr-CA"/>
         </w:rPr>
-        <w:t>"--entrypoints.websecure.http.tls.domains[0].main=${MY_DOMAIN}"</w:t>
+        <w:t>"</w:t>
+      </w:r>
+      <w:proofErr w:type="gramStart"/>
+      <w:r>
+        <w:rPr>
+          <w:rFonts w:ascii="Consolas" w:eastAsia="Times New Roman" w:hAnsi="Consolas" w:cs="Times New Roman"/>
+          <w:color w:val="CE9178"/>
+          <w:sz w:val="21"/>
+          <w:szCs w:val="21"/>
+          <w:lang w:val="en-US" w:eastAsia="fr-CA"/>
+        </w:rPr>
+        <w:t>--entrypoints.websecure.http.tls.domains</w:t>
+      </w:r>
+      <w:proofErr w:type="gramEnd"/>
+      <w:r>
+        <w:rPr>
+          <w:rFonts w:ascii="Consolas" w:eastAsia="Times New Roman" w:hAnsi="Consolas" w:cs="Times New Roman"/>
+          <w:color w:val="CE9178"/>
+          <w:sz w:val="21"/>
+          <w:szCs w:val="21"/>
+          <w:lang w:val="en-US" w:eastAsia="fr-CA"/>
+        </w:rPr>
+        <w:t>[0].main=${MY_DOMAIN}"</w:t>
       </w:r>
     </w:p>
     <w:p>
@@ -7996,7 +8642,29 @@
           <w:szCs w:val="21"/>
           <w:lang w:val="en-US" w:eastAsia="fr-CA"/>
         </w:rPr>
-        <w:t>"--entrypoints.websecure.http.tls.domains[0].sans=*.${MY_DOMAIN}"</w:t>
+        <w:t>"</w:t>
+      </w:r>
+      <w:proofErr w:type="gramStart"/>
+      <w:r>
+        <w:rPr>
+          <w:rFonts w:ascii="Consolas" w:eastAsia="Times New Roman" w:hAnsi="Consolas" w:cs="Times New Roman"/>
+          <w:color w:val="CE9178"/>
+          <w:sz w:val="21"/>
+          <w:szCs w:val="21"/>
+          <w:lang w:val="en-US" w:eastAsia="fr-CA"/>
+        </w:rPr>
+        <w:t>--entrypoints.websecure.http.tls.domains</w:t>
+      </w:r>
+      <w:proofErr w:type="gramEnd"/>
+      <w:r>
+        <w:rPr>
+          <w:rFonts w:ascii="Consolas" w:eastAsia="Times New Roman" w:hAnsi="Consolas" w:cs="Times New Roman"/>
+          <w:color w:val="CE9178"/>
+          <w:sz w:val="21"/>
+          <w:szCs w:val="21"/>
+          <w:lang w:val="en-US" w:eastAsia="fr-CA"/>
+        </w:rPr>
+        <w:t>[0].sans=*.${MY_DOMAIN}"</w:t>
       </w:r>
     </w:p>
     <w:p>
@@ -8054,6 +8722,7 @@
         </w:rPr>
         <w:t xml:space="preserve">    </w:t>
       </w:r>
+      <w:proofErr w:type="gramStart"/>
       <w:r>
         <w:rPr>
           <w:rFonts w:ascii="Consolas" w:eastAsia="Times New Roman" w:hAnsi="Consolas" w:cs="Times New Roman"/>
@@ -8064,6 +8733,7 @@
         </w:rPr>
         <w:t>volumes</w:t>
       </w:r>
+      <w:proofErr w:type="gramEnd"/>
       <w:r>
         <w:rPr>
           <w:rFonts w:ascii="Consolas" w:eastAsia="Times New Roman" w:hAnsi="Consolas" w:cs="Times New Roman"/>
@@ -8108,15 +8778,27 @@
         </w:rPr>
         <w:t xml:space="preserve">- </w:t>
       </w:r>
-      <w:r>
-        <w:rPr>
-          <w:rFonts w:ascii="Consolas" w:eastAsia="Times New Roman" w:hAnsi="Consolas" w:cs="Times New Roman"/>
-          <w:color w:val="CE9178"/>
-          <w:sz w:val="21"/>
-          <w:szCs w:val="21"/>
-          <w:lang w:val="en-US" w:eastAsia="fr-CA"/>
-        </w:rPr>
-        <w:t>"../data/traefik/letsencrypt:/letsencrypt"</w:t>
+      <w:proofErr w:type="gramStart"/>
+      <w:r>
+        <w:rPr>
+          <w:rFonts w:ascii="Consolas" w:eastAsia="Times New Roman" w:hAnsi="Consolas" w:cs="Times New Roman"/>
+          <w:color w:val="CE9178"/>
+          <w:sz w:val="21"/>
+          <w:szCs w:val="21"/>
+          <w:lang w:val="en-US" w:eastAsia="fr-CA"/>
+        </w:rPr>
+        <w:t>"..</w:t>
+      </w:r>
+      <w:proofErr w:type="gramEnd"/>
+      <w:r>
+        <w:rPr>
+          <w:rFonts w:ascii="Consolas" w:eastAsia="Times New Roman" w:hAnsi="Consolas" w:cs="Times New Roman"/>
+          <w:color w:val="CE9178"/>
+          <w:sz w:val="21"/>
+          <w:szCs w:val="21"/>
+          <w:lang w:val="en-US" w:eastAsia="fr-CA"/>
+        </w:rPr>
+        <w:t>/data/traefik/letsencrypt:/letsencrypt"</w:t>
       </w:r>
     </w:p>
     <w:p>
@@ -8280,7 +8962,29 @@
           <w:szCs w:val="21"/>
           <w:lang w:val="en-US" w:eastAsia="fr-CA"/>
         </w:rPr>
-        <w:t>'traefik.enable=true'</w:t>
+        <w:t>'</w:t>
+      </w:r>
+      <w:proofErr w:type="gramStart"/>
+      <w:r>
+        <w:rPr>
+          <w:rFonts w:ascii="Consolas" w:eastAsia="Times New Roman" w:hAnsi="Consolas" w:cs="Times New Roman"/>
+          <w:color w:val="CE9178"/>
+          <w:sz w:val="21"/>
+          <w:szCs w:val="21"/>
+          <w:lang w:val="en-US" w:eastAsia="fr-CA"/>
+        </w:rPr>
+        <w:t>traefik.enable</w:t>
+      </w:r>
+      <w:proofErr w:type="gramEnd"/>
+      <w:r>
+        <w:rPr>
+          <w:rFonts w:ascii="Consolas" w:eastAsia="Times New Roman" w:hAnsi="Consolas" w:cs="Times New Roman"/>
+          <w:color w:val="CE9178"/>
+          <w:sz w:val="21"/>
+          <w:szCs w:val="21"/>
+          <w:lang w:val="en-US" w:eastAsia="fr-CA"/>
+        </w:rPr>
+        <w:t>=true'</w:t>
       </w:r>
     </w:p>
     <w:p>
@@ -8313,7 +9017,29 @@
           <w:szCs w:val="21"/>
           <w:lang w:val="en-US" w:eastAsia="fr-CA"/>
         </w:rPr>
-        <w:t>'traefik.http.routers.api.rule=Host(`${MY_DOMAIN}`)'</w:t>
+        <w:t>'</w:t>
+      </w:r>
+      <w:proofErr w:type="gramStart"/>
+      <w:r>
+        <w:rPr>
+          <w:rFonts w:ascii="Consolas" w:eastAsia="Times New Roman" w:hAnsi="Consolas" w:cs="Times New Roman"/>
+          <w:color w:val="CE9178"/>
+          <w:sz w:val="21"/>
+          <w:szCs w:val="21"/>
+          <w:lang w:val="en-US" w:eastAsia="fr-CA"/>
+        </w:rPr>
+        <w:t>traefik.http.routers.api.rule</w:t>
+      </w:r>
+      <w:proofErr w:type="gramEnd"/>
+      <w:r>
+        <w:rPr>
+          <w:rFonts w:ascii="Consolas" w:eastAsia="Times New Roman" w:hAnsi="Consolas" w:cs="Times New Roman"/>
+          <w:color w:val="CE9178"/>
+          <w:sz w:val="21"/>
+          <w:szCs w:val="21"/>
+          <w:lang w:val="en-US" w:eastAsia="fr-CA"/>
+        </w:rPr>
+        <w:t>=Host(`${MY_DOMAIN}`)'</w:t>
       </w:r>
     </w:p>
     <w:p>
@@ -8346,7 +9072,29 @@
           <w:szCs w:val="21"/>
           <w:lang w:val="en-US" w:eastAsia="fr-CA"/>
         </w:rPr>
-        <w:t>'traefik.http.routers.api.entryPoints=websecure'</w:t>
+        <w:t>'</w:t>
+      </w:r>
+      <w:proofErr w:type="gramStart"/>
+      <w:r>
+        <w:rPr>
+          <w:rFonts w:ascii="Consolas" w:eastAsia="Times New Roman" w:hAnsi="Consolas" w:cs="Times New Roman"/>
+          <w:color w:val="CE9178"/>
+          <w:sz w:val="21"/>
+          <w:szCs w:val="21"/>
+          <w:lang w:val="en-US" w:eastAsia="fr-CA"/>
+        </w:rPr>
+        <w:t>traefik.http.routers.api.entryPoints</w:t>
+      </w:r>
+      <w:proofErr w:type="gramEnd"/>
+      <w:r>
+        <w:rPr>
+          <w:rFonts w:ascii="Consolas" w:eastAsia="Times New Roman" w:hAnsi="Consolas" w:cs="Times New Roman"/>
+          <w:color w:val="CE9178"/>
+          <w:sz w:val="21"/>
+          <w:szCs w:val="21"/>
+          <w:lang w:val="en-US" w:eastAsia="fr-CA"/>
+        </w:rPr>
+        <w:t>=websecure'</w:t>
       </w:r>
     </w:p>
     <w:p>
@@ -8379,7 +9127,29 @@
           <w:szCs w:val="21"/>
           <w:lang w:val="en-US" w:eastAsia="fr-CA"/>
         </w:rPr>
-        <w:t>'traefik.http.routers.api.service=api@internal'</w:t>
+        <w:t>'</w:t>
+      </w:r>
+      <w:proofErr w:type="gramStart"/>
+      <w:r>
+        <w:rPr>
+          <w:rFonts w:ascii="Consolas" w:eastAsia="Times New Roman" w:hAnsi="Consolas" w:cs="Times New Roman"/>
+          <w:color w:val="CE9178"/>
+          <w:sz w:val="21"/>
+          <w:szCs w:val="21"/>
+          <w:lang w:val="en-US" w:eastAsia="fr-CA"/>
+        </w:rPr>
+        <w:t>traefik.http.routers.api.service</w:t>
+      </w:r>
+      <w:proofErr w:type="gramEnd"/>
+      <w:r>
+        <w:rPr>
+          <w:rFonts w:ascii="Consolas" w:eastAsia="Times New Roman" w:hAnsi="Consolas" w:cs="Times New Roman"/>
+          <w:color w:val="CE9178"/>
+          <w:sz w:val="21"/>
+          <w:szCs w:val="21"/>
+          <w:lang w:val="en-US" w:eastAsia="fr-CA"/>
+        </w:rPr>
+        <w:t>=api@internal'</w:t>
       </w:r>
     </w:p>
     <w:p>
@@ -8437,6 +9207,7 @@
         </w:rPr>
         <w:t xml:space="preserve">    </w:t>
       </w:r>
+      <w:proofErr w:type="gramStart"/>
       <w:r>
         <w:rPr>
           <w:rFonts w:ascii="Consolas" w:eastAsia="Times New Roman" w:hAnsi="Consolas" w:cs="Times New Roman"/>
@@ -8447,6 +9218,7 @@
         </w:rPr>
         <w:t>ports</w:t>
       </w:r>
+      <w:proofErr w:type="gramEnd"/>
       <w:r>
         <w:rPr>
           <w:rFonts w:ascii="Consolas" w:eastAsia="Times New Roman" w:hAnsi="Consolas" w:cs="Times New Roman"/>
@@ -8713,6 +9485,7 @@
         </w:rPr>
         <w:t xml:space="preserve">  </w:t>
       </w:r>
+      <w:proofErr w:type="gramStart"/>
       <w:r>
         <w:rPr>
           <w:rFonts w:ascii="Consolas" w:eastAsia="Times New Roman" w:hAnsi="Consolas" w:cs="Times New Roman"/>
@@ -8723,6 +9496,7 @@
         </w:rPr>
         <w:t>backend</w:t>
       </w:r>
+      <w:proofErr w:type="gramEnd"/>
       <w:r>
         <w:rPr>
           <w:rFonts w:ascii="Consolas" w:eastAsia="Times New Roman" w:hAnsi="Consolas" w:cs="Times New Roman"/>
@@ -8789,6 +9563,7 @@
         </w:rPr>
         <w:t xml:space="preserve">    </w:t>
       </w:r>
+      <w:proofErr w:type="gramStart"/>
       <w:r>
         <w:rPr>
           <w:rFonts w:ascii="Consolas" w:eastAsia="Times New Roman" w:hAnsi="Consolas" w:cs="Times New Roman"/>
@@ -8799,6 +9574,7 @@
         </w:rPr>
         <w:t>image</w:t>
       </w:r>
+      <w:proofErr w:type="gramEnd"/>
       <w:r>
         <w:rPr>
           <w:rFonts w:ascii="Consolas" w:eastAsia="Times New Roman" w:hAnsi="Consolas" w:cs="Times New Roman"/>
@@ -8888,6 +9664,7 @@
         <w:t xml:space="preserve">    </w:t>
       </w:r>
       <w:proofErr w:type="spellStart"/>
+      <w:proofErr w:type="gramStart"/>
       <w:r>
         <w:rPr>
           <w:rFonts w:ascii="Consolas" w:eastAsia="Times New Roman" w:hAnsi="Consolas" w:cs="Times New Roman"/>
@@ -8896,7 +9673,18 @@
           <w:szCs w:val="21"/>
           <w:lang w:val="fr-CA" w:eastAsia="fr-CA"/>
         </w:rPr>
-        <w:t>container_name</w:t>
+        <w:t>container</w:t>
+      </w:r>
+      <w:proofErr w:type="gramEnd"/>
+      <w:r>
+        <w:rPr>
+          <w:rFonts w:ascii="Consolas" w:eastAsia="Times New Roman" w:hAnsi="Consolas" w:cs="Times New Roman"/>
+          <w:color w:val="569CD6"/>
+          <w:sz w:val="21"/>
+          <w:szCs w:val="21"/>
+          <w:lang w:val="fr-CA" w:eastAsia="fr-CA"/>
+        </w:rPr>
+        <w:t>_name</w:t>
       </w:r>
       <w:proofErr w:type="spellEnd"/>
       <w:r>
@@ -8978,6 +9766,7 @@
         <w:t xml:space="preserve">    </w:t>
       </w:r>
       <w:proofErr w:type="spellStart"/>
+      <w:proofErr w:type="gramStart"/>
       <w:r>
         <w:rPr>
           <w:rFonts w:ascii="Consolas" w:eastAsia="Times New Roman" w:hAnsi="Consolas" w:cs="Times New Roman"/>
@@ -8989,6 +9778,7 @@
         <w:t>build</w:t>
       </w:r>
       <w:proofErr w:type="spellEnd"/>
+      <w:proofErr w:type="gramEnd"/>
       <w:r>
         <w:rPr>
           <w:rFonts w:ascii="Consolas" w:eastAsia="Times New Roman" w:hAnsi="Consolas" w:cs="Times New Roman"/>
@@ -9023,6 +9813,7 @@
         <w:t xml:space="preserve">      </w:t>
       </w:r>
       <w:proofErr w:type="spellStart"/>
+      <w:proofErr w:type="gramStart"/>
       <w:r>
         <w:rPr>
           <w:rFonts w:ascii="Consolas" w:eastAsia="Times New Roman" w:hAnsi="Consolas" w:cs="Times New Roman"/>
@@ -9034,6 +9825,7 @@
         <w:t>context</w:t>
       </w:r>
       <w:proofErr w:type="spellEnd"/>
+      <w:proofErr w:type="gramEnd"/>
       <w:r>
         <w:rPr>
           <w:rFonts w:ascii="Consolas" w:eastAsia="Times New Roman" w:hAnsi="Consolas" w:cs="Times New Roman"/>
@@ -9110,6 +9902,7 @@
         </w:rPr>
         <w:t xml:space="preserve">    </w:t>
       </w:r>
+      <w:proofErr w:type="gramStart"/>
       <w:r>
         <w:rPr>
           <w:rFonts w:ascii="Consolas" w:eastAsia="Times New Roman" w:hAnsi="Consolas" w:cs="Times New Roman"/>
@@ -9120,6 +9913,7 @@
         </w:rPr>
         <w:t>ports</w:t>
       </w:r>
+      <w:proofErr w:type="gramEnd"/>
       <w:r>
         <w:rPr>
           <w:rFonts w:ascii="Consolas" w:eastAsia="Times New Roman" w:hAnsi="Consolas" w:cs="Times New Roman"/>
@@ -9219,6 +10013,7 @@
         </w:rPr>
         <w:t xml:space="preserve">    </w:t>
       </w:r>
+      <w:proofErr w:type="gramStart"/>
       <w:r>
         <w:rPr>
           <w:rFonts w:ascii="Consolas" w:eastAsia="Times New Roman" w:hAnsi="Consolas" w:cs="Times New Roman"/>
@@ -9229,6 +10024,7 @@
         </w:rPr>
         <w:t>networks</w:t>
       </w:r>
+      <w:proofErr w:type="gramEnd"/>
       <w:r>
         <w:rPr>
           <w:rFonts w:ascii="Consolas" w:eastAsia="Times New Roman" w:hAnsi="Consolas" w:cs="Times New Roman"/>
@@ -9401,7 +10197,29 @@
           <w:szCs w:val="21"/>
           <w:lang w:val="en-US" w:eastAsia="fr-CA"/>
         </w:rPr>
-        <w:t>"traefik.enable=true"</w:t>
+        <w:t>"</w:t>
+      </w:r>
+      <w:proofErr w:type="gramStart"/>
+      <w:r>
+        <w:rPr>
+          <w:rFonts w:ascii="Consolas" w:eastAsia="Times New Roman" w:hAnsi="Consolas" w:cs="Times New Roman"/>
+          <w:color w:val="CE9178"/>
+          <w:sz w:val="21"/>
+          <w:szCs w:val="21"/>
+          <w:lang w:val="en-US" w:eastAsia="fr-CA"/>
+        </w:rPr>
+        <w:t>traefik.enable</w:t>
+      </w:r>
+      <w:proofErr w:type="gramEnd"/>
+      <w:r>
+        <w:rPr>
+          <w:rFonts w:ascii="Consolas" w:eastAsia="Times New Roman" w:hAnsi="Consolas" w:cs="Times New Roman"/>
+          <w:color w:val="CE9178"/>
+          <w:sz w:val="21"/>
+          <w:szCs w:val="21"/>
+          <w:lang w:val="en-US" w:eastAsia="fr-CA"/>
+        </w:rPr>
+        <w:t>=true"</w:t>
       </w:r>
     </w:p>
     <w:p>
@@ -9434,7 +10252,29 @@
           <w:szCs w:val="21"/>
           <w:lang w:val="en-US" w:eastAsia="fr-CA"/>
         </w:rPr>
-        <w:t>"traefik.http.routers.backend.rule=Host(`backend.${MY_DOMAIN}`)"</w:t>
+        <w:t>"</w:t>
+      </w:r>
+      <w:proofErr w:type="gramStart"/>
+      <w:r>
+        <w:rPr>
+          <w:rFonts w:ascii="Consolas" w:eastAsia="Times New Roman" w:hAnsi="Consolas" w:cs="Times New Roman"/>
+          <w:color w:val="CE9178"/>
+          <w:sz w:val="21"/>
+          <w:szCs w:val="21"/>
+          <w:lang w:val="en-US" w:eastAsia="fr-CA"/>
+        </w:rPr>
+        <w:t>traefik.http</w:t>
+      </w:r>
+      <w:proofErr w:type="gramEnd"/>
+      <w:r>
+        <w:rPr>
+          <w:rFonts w:ascii="Consolas" w:eastAsia="Times New Roman" w:hAnsi="Consolas" w:cs="Times New Roman"/>
+          <w:color w:val="CE9178"/>
+          <w:sz w:val="21"/>
+          <w:szCs w:val="21"/>
+          <w:lang w:val="en-US" w:eastAsia="fr-CA"/>
+        </w:rPr>
+        <w:t>.routers.backend.rule=Host(`backend.${MY_DOMAIN}`)"</w:t>
       </w:r>
     </w:p>
     <w:p>
@@ -9467,7 +10307,29 @@
           <w:szCs w:val="21"/>
           <w:lang w:val="en-US" w:eastAsia="fr-CA"/>
         </w:rPr>
-        <w:t>"traefik.http.routers.backend.entryPoints=websecure"</w:t>
+        <w:t>"</w:t>
+      </w:r>
+      <w:proofErr w:type="gramStart"/>
+      <w:r>
+        <w:rPr>
+          <w:rFonts w:ascii="Consolas" w:eastAsia="Times New Roman" w:hAnsi="Consolas" w:cs="Times New Roman"/>
+          <w:color w:val="CE9178"/>
+          <w:sz w:val="21"/>
+          <w:szCs w:val="21"/>
+          <w:lang w:val="en-US" w:eastAsia="fr-CA"/>
+        </w:rPr>
+        <w:t>traefik.http</w:t>
+      </w:r>
+      <w:proofErr w:type="gramEnd"/>
+      <w:r>
+        <w:rPr>
+          <w:rFonts w:ascii="Consolas" w:eastAsia="Times New Roman" w:hAnsi="Consolas" w:cs="Times New Roman"/>
+          <w:color w:val="CE9178"/>
+          <w:sz w:val="21"/>
+          <w:szCs w:val="21"/>
+          <w:lang w:val="en-US" w:eastAsia="fr-CA"/>
+        </w:rPr>
+        <w:t>.routers.backend.entryPoints=websecure"</w:t>
       </w:r>
     </w:p>
     <w:p>
@@ -9538,6 +10400,7 @@
         </w:rPr>
         <w:t xml:space="preserve">  </w:t>
       </w:r>
+      <w:proofErr w:type="gramStart"/>
       <w:r>
         <w:rPr>
           <w:rFonts w:ascii="Consolas" w:eastAsia="Times New Roman" w:hAnsi="Consolas" w:cs="Times New Roman"/>
@@ -9548,6 +10411,7 @@
         </w:rPr>
         <w:t>frontend</w:t>
       </w:r>
+      <w:proofErr w:type="gramEnd"/>
       <w:r>
         <w:rPr>
           <w:rFonts w:ascii="Consolas" w:eastAsia="Times New Roman" w:hAnsi="Consolas" w:cs="Times New Roman"/>
@@ -9614,6 +10478,7 @@
         </w:rPr>
         <w:t xml:space="preserve">    </w:t>
       </w:r>
+      <w:proofErr w:type="gramStart"/>
       <w:r>
         <w:rPr>
           <w:rFonts w:ascii="Consolas" w:eastAsia="Times New Roman" w:hAnsi="Consolas" w:cs="Times New Roman"/>
@@ -9624,6 +10489,7 @@
         </w:rPr>
         <w:t>image</w:t>
       </w:r>
+      <w:proofErr w:type="gramEnd"/>
       <w:r>
         <w:rPr>
           <w:rFonts w:ascii="Consolas" w:eastAsia="Times New Roman" w:hAnsi="Consolas" w:cs="Times New Roman"/>
@@ -9713,6 +10579,7 @@
         <w:t xml:space="preserve">    </w:t>
       </w:r>
       <w:proofErr w:type="spellStart"/>
+      <w:proofErr w:type="gramStart"/>
       <w:r>
         <w:rPr>
           <w:rFonts w:ascii="Consolas" w:eastAsia="Times New Roman" w:hAnsi="Consolas" w:cs="Times New Roman"/>
@@ -9721,7 +10588,18 @@
           <w:szCs w:val="21"/>
           <w:lang w:val="fr-CA" w:eastAsia="fr-CA"/>
         </w:rPr>
-        <w:t>container_name</w:t>
+        <w:t>container</w:t>
+      </w:r>
+      <w:proofErr w:type="gramEnd"/>
+      <w:r>
+        <w:rPr>
+          <w:rFonts w:ascii="Consolas" w:eastAsia="Times New Roman" w:hAnsi="Consolas" w:cs="Times New Roman"/>
+          <w:color w:val="569CD6"/>
+          <w:sz w:val="21"/>
+          <w:szCs w:val="21"/>
+          <w:lang w:val="fr-CA" w:eastAsia="fr-CA"/>
+        </w:rPr>
+        <w:t>_name</w:t>
       </w:r>
       <w:proofErr w:type="spellEnd"/>
       <w:r>
@@ -9803,6 +10681,7 @@
         <w:t xml:space="preserve">    </w:t>
       </w:r>
       <w:proofErr w:type="spellStart"/>
+      <w:proofErr w:type="gramStart"/>
       <w:r>
         <w:rPr>
           <w:rFonts w:ascii="Consolas" w:eastAsia="Times New Roman" w:hAnsi="Consolas" w:cs="Times New Roman"/>
@@ -9814,6 +10693,7 @@
         <w:t>build</w:t>
       </w:r>
       <w:proofErr w:type="spellEnd"/>
+      <w:proofErr w:type="gramEnd"/>
       <w:r>
         <w:rPr>
           <w:rFonts w:ascii="Consolas" w:eastAsia="Times New Roman" w:hAnsi="Consolas" w:cs="Times New Roman"/>
@@ -9848,6 +10728,7 @@
         <w:t xml:space="preserve">      </w:t>
       </w:r>
       <w:proofErr w:type="spellStart"/>
+      <w:proofErr w:type="gramStart"/>
       <w:r>
         <w:rPr>
           <w:rFonts w:ascii="Consolas" w:eastAsia="Times New Roman" w:hAnsi="Consolas" w:cs="Times New Roman"/>
@@ -9859,6 +10740,7 @@
         <w:t>context</w:t>
       </w:r>
       <w:proofErr w:type="spellEnd"/>
+      <w:proofErr w:type="gramEnd"/>
       <w:r>
         <w:rPr>
           <w:rFonts w:ascii="Consolas" w:eastAsia="Times New Roman" w:hAnsi="Consolas" w:cs="Times New Roman"/>
@@ -9935,6 +10817,7 @@
         </w:rPr>
         <w:t xml:space="preserve">    </w:t>
       </w:r>
+      <w:proofErr w:type="gramStart"/>
       <w:r>
         <w:rPr>
           <w:rFonts w:ascii="Consolas" w:eastAsia="Times New Roman" w:hAnsi="Consolas" w:cs="Times New Roman"/>
@@ -9945,6 +10828,7 @@
         </w:rPr>
         <w:t>ports</w:t>
       </w:r>
+      <w:proofErr w:type="gramEnd"/>
       <w:r>
         <w:rPr>
           <w:rFonts w:ascii="Consolas" w:eastAsia="Times New Roman" w:hAnsi="Consolas" w:cs="Times New Roman"/>
@@ -10046,6 +10930,7 @@
         <w:t xml:space="preserve">    </w:t>
       </w:r>
       <w:proofErr w:type="spellStart"/>
+      <w:proofErr w:type="gramStart"/>
       <w:r>
         <w:rPr>
           <w:rFonts w:ascii="Consolas" w:eastAsia="Times New Roman" w:hAnsi="Consolas" w:cs="Times New Roman"/>
@@ -10054,7 +10939,18 @@
           <w:szCs w:val="21"/>
           <w:lang w:val="fr-CA" w:eastAsia="fr-CA"/>
         </w:rPr>
-        <w:t>depends_on</w:t>
+        <w:t>depends</w:t>
+      </w:r>
+      <w:proofErr w:type="gramEnd"/>
+      <w:r>
+        <w:rPr>
+          <w:rFonts w:ascii="Consolas" w:eastAsia="Times New Roman" w:hAnsi="Consolas" w:cs="Times New Roman"/>
+          <w:color w:val="569CD6"/>
+          <w:sz w:val="21"/>
+          <w:szCs w:val="21"/>
+          <w:lang w:val="fr-CA" w:eastAsia="fr-CA"/>
+        </w:rPr>
+        <w:t>_on</w:t>
       </w:r>
       <w:proofErr w:type="spellEnd"/>
       <w:r>
@@ -10156,6 +11052,7 @@
         </w:rPr>
         <w:t xml:space="preserve">    </w:t>
       </w:r>
+      <w:proofErr w:type="gramStart"/>
       <w:r>
         <w:rPr>
           <w:rFonts w:ascii="Consolas" w:eastAsia="Times New Roman" w:hAnsi="Consolas" w:cs="Times New Roman"/>
@@ -10166,6 +11063,7 @@
         </w:rPr>
         <w:t>networks</w:t>
       </w:r>
+      <w:proofErr w:type="gramEnd"/>
       <w:r>
         <w:rPr>
           <w:rFonts w:ascii="Consolas" w:eastAsia="Times New Roman" w:hAnsi="Consolas" w:cs="Times New Roman"/>
@@ -10338,7 +11236,29 @@
           <w:szCs w:val="21"/>
           <w:lang w:val="en-US" w:eastAsia="fr-CA"/>
         </w:rPr>
-        <w:t>"traefik.enable=true"</w:t>
+        <w:t>"</w:t>
+      </w:r>
+      <w:proofErr w:type="gramStart"/>
+      <w:r>
+        <w:rPr>
+          <w:rFonts w:ascii="Consolas" w:eastAsia="Times New Roman" w:hAnsi="Consolas" w:cs="Times New Roman"/>
+          <w:color w:val="CE9178"/>
+          <w:sz w:val="21"/>
+          <w:szCs w:val="21"/>
+          <w:lang w:val="en-US" w:eastAsia="fr-CA"/>
+        </w:rPr>
+        <w:t>traefik.enable</w:t>
+      </w:r>
+      <w:proofErr w:type="gramEnd"/>
+      <w:r>
+        <w:rPr>
+          <w:rFonts w:ascii="Consolas" w:eastAsia="Times New Roman" w:hAnsi="Consolas" w:cs="Times New Roman"/>
+          <w:color w:val="CE9178"/>
+          <w:sz w:val="21"/>
+          <w:szCs w:val="21"/>
+          <w:lang w:val="en-US" w:eastAsia="fr-CA"/>
+        </w:rPr>
+        <w:t>=true"</w:t>
       </w:r>
     </w:p>
     <w:p>
@@ -10371,7 +11291,29 @@
           <w:szCs w:val="21"/>
           <w:lang w:val="en-US" w:eastAsia="fr-CA"/>
         </w:rPr>
-        <w:t>"traefik.http.routers.frontendtrack.rule=Host(`frontendtrack.${MY_DOMAIN}`)"</w:t>
+        <w:t>"</w:t>
+      </w:r>
+      <w:proofErr w:type="gramStart"/>
+      <w:r>
+        <w:rPr>
+          <w:rFonts w:ascii="Consolas" w:eastAsia="Times New Roman" w:hAnsi="Consolas" w:cs="Times New Roman"/>
+          <w:color w:val="CE9178"/>
+          <w:sz w:val="21"/>
+          <w:szCs w:val="21"/>
+          <w:lang w:val="en-US" w:eastAsia="fr-CA"/>
+        </w:rPr>
+        <w:t>traefik.http</w:t>
+      </w:r>
+      <w:proofErr w:type="gramEnd"/>
+      <w:r>
+        <w:rPr>
+          <w:rFonts w:ascii="Consolas" w:eastAsia="Times New Roman" w:hAnsi="Consolas" w:cs="Times New Roman"/>
+          <w:color w:val="CE9178"/>
+          <w:sz w:val="21"/>
+          <w:szCs w:val="21"/>
+          <w:lang w:val="en-US" w:eastAsia="fr-CA"/>
+        </w:rPr>
+        <w:t>.routers.frontendtrack.rule=Host(`frontendtrack.${MY_DOMAIN}`)"</w:t>
       </w:r>
     </w:p>
     <w:p>
@@ -10404,7 +11346,29 @@
           <w:szCs w:val="21"/>
           <w:lang w:val="en-US" w:eastAsia="fr-CA"/>
         </w:rPr>
-        <w:t>"traefik.http.routers.frontendtrack.entryPoints=websecure"</w:t>
+        <w:t>"</w:t>
+      </w:r>
+      <w:proofErr w:type="gramStart"/>
+      <w:r>
+        <w:rPr>
+          <w:rFonts w:ascii="Consolas" w:eastAsia="Times New Roman" w:hAnsi="Consolas" w:cs="Times New Roman"/>
+          <w:color w:val="CE9178"/>
+          <w:sz w:val="21"/>
+          <w:szCs w:val="21"/>
+          <w:lang w:val="en-US" w:eastAsia="fr-CA"/>
+        </w:rPr>
+        <w:t>traefik.http</w:t>
+      </w:r>
+      <w:proofErr w:type="gramEnd"/>
+      <w:r>
+        <w:rPr>
+          <w:rFonts w:ascii="Consolas" w:eastAsia="Times New Roman" w:hAnsi="Consolas" w:cs="Times New Roman"/>
+          <w:color w:val="CE9178"/>
+          <w:sz w:val="21"/>
+          <w:szCs w:val="21"/>
+          <w:lang w:val="en-US" w:eastAsia="fr-CA"/>
+        </w:rPr>
+        <w:t>.routers.frontendtrack.entryPoints=websecure"</w:t>
       </w:r>
     </w:p>
     <w:p>
@@ -10465,6 +11429,7 @@
           <w:lang w:val="fr-CA" w:eastAsia="fr-CA"/>
         </w:rPr>
       </w:pPr>
+      <w:proofErr w:type="gramStart"/>
       <w:r>
         <w:rPr>
           <w:rFonts w:ascii="Consolas" w:eastAsia="Times New Roman" w:hAnsi="Consolas" w:cs="Times New Roman"/>
@@ -10475,6 +11440,7 @@
         </w:rPr>
         <w:t>volumes</w:t>
       </w:r>
+      <w:proofErr w:type="gramEnd"/>
       <w:r>
         <w:rPr>
           <w:rFonts w:ascii="Consolas" w:eastAsia="Times New Roman" w:hAnsi="Consolas" w:cs="Times New Roman"/>
@@ -10554,6 +11520,7 @@
         <w:t xml:space="preserve">  </w:t>
       </w:r>
       <w:proofErr w:type="spellStart"/>
+      <w:proofErr w:type="gramStart"/>
       <w:r>
         <w:rPr>
           <w:rFonts w:ascii="Consolas" w:eastAsia="Times New Roman" w:hAnsi="Consolas" w:cs="Times New Roman"/>
@@ -10562,7 +11529,18 @@
           <w:szCs w:val="21"/>
           <w:lang w:val="fr-CA" w:eastAsia="fr-CA"/>
         </w:rPr>
-        <w:t>portainer_data</w:t>
+        <w:t>portainer</w:t>
+      </w:r>
+      <w:proofErr w:type="gramEnd"/>
+      <w:r>
+        <w:rPr>
+          <w:rFonts w:ascii="Consolas" w:eastAsia="Times New Roman" w:hAnsi="Consolas" w:cs="Times New Roman"/>
+          <w:color w:val="569CD6"/>
+          <w:sz w:val="21"/>
+          <w:szCs w:val="21"/>
+          <w:lang w:val="fr-CA" w:eastAsia="fr-CA"/>
+        </w:rPr>
+        <w:t>_data</w:t>
       </w:r>
       <w:proofErr w:type="spellEnd"/>
       <w:r>
@@ -10676,6 +11654,7 @@
         <w:t xml:space="preserve">  </w:t>
       </w:r>
       <w:proofErr w:type="spellStart"/>
+      <w:proofErr w:type="gramStart"/>
       <w:r>
         <w:rPr>
           <w:rFonts w:ascii="Consolas" w:eastAsia="Times New Roman" w:hAnsi="Consolas" w:cs="Times New Roman"/>
@@ -10687,6 +11666,7 @@
         <w:t>nextclouddb</w:t>
       </w:r>
       <w:proofErr w:type="spellEnd"/>
+      <w:proofErr w:type="gramEnd"/>
       <w:r>
         <w:rPr>
           <w:rFonts w:ascii="Consolas" w:eastAsia="Times New Roman" w:hAnsi="Consolas" w:cs="Times New Roman"/>
@@ -10766,6 +11746,7 @@
         <w:t xml:space="preserve">  </w:t>
       </w:r>
       <w:proofErr w:type="spellStart"/>
+      <w:proofErr w:type="gramStart"/>
       <w:r>
         <w:rPr>
           <w:rFonts w:ascii="Consolas" w:eastAsia="Times New Roman" w:hAnsi="Consolas" w:cs="Times New Roman"/>
@@ -10774,7 +11755,18 @@
           <w:szCs w:val="21"/>
           <w:lang w:val="fr-CA" w:eastAsia="fr-CA"/>
         </w:rPr>
-        <w:t>jellyfin_data</w:t>
+        <w:t>jellyfin</w:t>
+      </w:r>
+      <w:proofErr w:type="gramEnd"/>
+      <w:r>
+        <w:rPr>
+          <w:rFonts w:ascii="Consolas" w:eastAsia="Times New Roman" w:hAnsi="Consolas" w:cs="Times New Roman"/>
+          <w:color w:val="569CD6"/>
+          <w:sz w:val="21"/>
+          <w:szCs w:val="21"/>
+          <w:lang w:val="fr-CA" w:eastAsia="fr-CA"/>
+        </w:rPr>
+        <w:t>_data</w:t>
       </w:r>
       <w:proofErr w:type="spellEnd"/>
       <w:r>
@@ -10836,6 +11828,7 @@
           <w:lang w:val="fr-CA" w:eastAsia="fr-CA"/>
         </w:rPr>
       </w:pPr>
+      <w:proofErr w:type="gramStart"/>
       <w:r>
         <w:rPr>
           <w:rFonts w:ascii="Consolas" w:eastAsia="Times New Roman" w:hAnsi="Consolas" w:cs="Times New Roman"/>
@@ -10846,6 +11839,7 @@
         </w:rPr>
         <w:t>networks</w:t>
       </w:r>
+      <w:proofErr w:type="gramEnd"/>
       <w:r>
         <w:rPr>
           <w:rFonts w:ascii="Consolas" w:eastAsia="Times New Roman" w:hAnsi="Consolas" w:cs="Times New Roman"/>
@@ -10879,6 +11873,7 @@
         </w:rPr>
         <w:t xml:space="preserve">  </w:t>
       </w:r>
+      <w:proofErr w:type="gramStart"/>
       <w:r>
         <w:rPr>
           <w:rFonts w:ascii="Consolas" w:eastAsia="Times New Roman" w:hAnsi="Consolas" w:cs="Times New Roman"/>
@@ -10889,6 +11884,7 @@
         </w:rPr>
         <w:t>cloud</w:t>
       </w:r>
+      <w:proofErr w:type="gramEnd"/>
       <w:r>
         <w:rPr>
           <w:rFonts w:ascii="Consolas" w:eastAsia="Times New Roman" w:hAnsi="Consolas" w:cs="Times New Roman"/>
@@ -10955,6 +11951,7 @@
         </w:rPr>
         <w:t xml:space="preserve">    </w:t>
       </w:r>
+      <w:proofErr w:type="gramStart"/>
       <w:r>
         <w:rPr>
           <w:rFonts w:ascii="Consolas" w:eastAsia="Times New Roman" w:hAnsi="Consolas" w:cs="Times New Roman"/>
@@ -10965,6 +11962,7 @@
         </w:rPr>
         <w:t>driver</w:t>
       </w:r>
+      <w:proofErr w:type="gramEnd"/>
       <w:r>
         <w:rPr>
           <w:rFonts w:ascii="Consolas" w:eastAsia="Times New Roman" w:hAnsi="Consolas" w:cs="Times New Roman"/>
@@ -11025,6 +12023,7 @@
           <w:sz w:val="24"/>
           <w:szCs w:val="24"/>
         </w:rPr>
+        <w:lastRenderedPageBreak/>
         <w:t>Partie II - Déploiement sur AWS</w:t>
       </w:r>
     </w:p>
@@ -11049,26 +12048,47 @@
       </w:r>
     </w:p>
     <w:p>
-      <w:pPr>
-        <w:rPr>
-          <w:rFonts w:ascii="Times New Roman" w:hAnsi="Times New Roman" w:cs="Times New Roman"/>
-          <w:i/>
-          <w:color w:val="073763"/>
-          <w:sz w:val="24"/>
-          <w:szCs w:val="24"/>
-        </w:rPr>
-      </w:pPr>
-      <w:r>
-        <w:rPr>
-          <w:rFonts w:ascii="Times New Roman" w:hAnsi="Times New Roman" w:cs="Times New Roman"/>
-          <w:i/>
-          <w:color w:val="073763"/>
-          <w:sz w:val="24"/>
-          <w:szCs w:val="24"/>
-        </w:rPr>
-        <w:t>Insérez une capture d'écran (ou spécifiez le nom du fichier) de l’onglet “mappage des ressources” de votre VPC.</w:t>
-      </w:r>
-    </w:p>
+      <w:r>
+        <w:drawing>
+          <wp:inline distT="0" distB="0" distL="0" distR="0" wp14:anchorId="4EACA195" wp14:editId="3795B3A0">
+            <wp:extent cx="5733415" cy="2881630"/>
+            <wp:effectExtent l="0" t="0" r="635" b="0"/>
+            <wp:docPr id="2" name="Image 2"/>
+            <wp:cNvGraphicFramePr>
+              <a:graphicFrameLocks xmlns:a="http://schemas.openxmlformats.org/drawingml/2006/main" noChangeAspect="1"/>
+            </wp:cNvGraphicFramePr>
+            <a:graphic xmlns:a="http://schemas.openxmlformats.org/drawingml/2006/main">
+              <a:graphicData uri="http://schemas.openxmlformats.org/drawingml/2006/picture">
+                <pic:pic xmlns:pic="http://schemas.openxmlformats.org/drawingml/2006/picture">
+                  <pic:nvPicPr>
+                    <pic:cNvPr id="1" name=""/>
+                    <pic:cNvPicPr/>
+                  </pic:nvPicPr>
+                  <pic:blipFill>
+                    <a:blip r:embed="rId6"/>
+                    <a:stretch>
+                      <a:fillRect/>
+                    </a:stretch>
+                  </pic:blipFill>
+                  <pic:spPr>
+                    <a:xfrm>
+                      <a:off x="0" y="0"/>
+                      <a:ext cx="5733415" cy="2881630"/>
+                    </a:xfrm>
+                    <a:prstGeom prst="rect">
+                      <a:avLst/>
+                    </a:prstGeom>
+                  </pic:spPr>
+                </pic:pic>
+              </a:graphicData>
+            </a:graphic>
+          </wp:inline>
+        </w:drawing>
+      </w:r>
+      <w:bookmarkStart w:id="5" w:name="_masnmwax546h" w:colFirst="0" w:colLast="0"/>
+      <w:bookmarkEnd w:id="5"/>
+    </w:p>
+    <w:p/>
     <w:p>
       <w:pPr>
         <w:pStyle w:val="Titre4"/>
@@ -11080,8 +12100,6 @@
           <w:rFonts w:ascii="Times New Roman" w:hAnsi="Times New Roman" w:cs="Times New Roman"/>
         </w:rPr>
       </w:pPr>
-      <w:bookmarkStart w:id="5" w:name="_masnmwax546h" w:colFirst="0" w:colLast="0"/>
-      <w:bookmarkEnd w:id="5"/>
       <w:r>
         <w:rPr>
           <w:rFonts w:ascii="Times New Roman" w:hAnsi="Times New Roman" w:cs="Times New Roman"/>
@@ -11090,34 +12108,42 @@
       </w:r>
     </w:p>
     <w:p>
-      <w:pPr>
-        <w:rPr>
-          <w:rFonts w:ascii="Times New Roman" w:hAnsi="Times New Roman" w:cs="Times New Roman"/>
-          <w:i/>
-          <w:color w:val="073763"/>
-          <w:sz w:val="24"/>
-          <w:szCs w:val="24"/>
-        </w:rPr>
-      </w:pPr>
-      <w:r>
-        <w:rPr>
-          <w:rFonts w:ascii="Times New Roman" w:hAnsi="Times New Roman" w:cs="Times New Roman"/>
-          <w:i/>
-          <w:color w:val="073763"/>
-          <w:sz w:val="24"/>
-          <w:szCs w:val="24"/>
-        </w:rPr>
-        <w:t>Insérez une capture d’écra</w:t>
-      </w:r>
-      <w:r>
-        <w:rPr>
-          <w:rFonts w:ascii="Times New Roman" w:hAnsi="Times New Roman" w:cs="Times New Roman"/>
-          <w:i/>
-          <w:color w:val="073763"/>
-          <w:sz w:val="24"/>
-          <w:szCs w:val="24"/>
-        </w:rPr>
-        <w:t>n (ou spécifiez le nom du fichier) de l’onglet “détails” de chaque sous-réseau créé.</w:t>
+      <w:r>
+        <w:drawing>
+          <wp:inline distT="0" distB="0" distL="0" distR="0" wp14:anchorId="41029FB4" wp14:editId="6A610C6D">
+            <wp:extent cx="5733415" cy="2968625"/>
+            <wp:effectExtent l="0" t="0" r="635" b="3175"/>
+            <wp:docPr id="3" name="Image 3"/>
+            <wp:cNvGraphicFramePr>
+              <a:graphicFrameLocks xmlns:a="http://schemas.openxmlformats.org/drawingml/2006/main" noChangeAspect="1"/>
+            </wp:cNvGraphicFramePr>
+            <a:graphic xmlns:a="http://schemas.openxmlformats.org/drawingml/2006/main">
+              <a:graphicData uri="http://schemas.openxmlformats.org/drawingml/2006/picture">
+                <pic:pic xmlns:pic="http://schemas.openxmlformats.org/drawingml/2006/picture">
+                  <pic:nvPicPr>
+                    <pic:cNvPr id="1" name=""/>
+                    <pic:cNvPicPr/>
+                  </pic:nvPicPr>
+                  <pic:blipFill>
+                    <a:blip r:embed="rId7"/>
+                    <a:stretch>
+                      <a:fillRect/>
+                    </a:stretch>
+                  </pic:blipFill>
+                  <pic:spPr>
+                    <a:xfrm>
+                      <a:off x="0" y="0"/>
+                      <a:ext cx="5733415" cy="2968625"/>
+                    </a:xfrm>
+                    <a:prstGeom prst="rect">
+                      <a:avLst/>
+                    </a:prstGeom>
+                  </pic:spPr>
+                </pic:pic>
+              </a:graphicData>
+            </a:graphic>
+          </wp:inline>
+        </w:drawing>
       </w:r>
     </w:p>
     <w:p>
@@ -11137,49 +12163,86 @@
         <w:rPr>
           <w:rFonts w:ascii="Times New Roman" w:hAnsi="Times New Roman" w:cs="Times New Roman"/>
         </w:rPr>
+        <w:lastRenderedPageBreak/>
         <w:t>Groupes de sécurité</w:t>
       </w:r>
     </w:p>
     <w:p>
-      <w:pPr>
-        <w:rPr>
-          <w:rFonts w:ascii="Times New Roman" w:hAnsi="Times New Roman" w:cs="Times New Roman"/>
-          <w:i/>
-          <w:color w:val="073763"/>
-          <w:sz w:val="24"/>
-          <w:szCs w:val="24"/>
-        </w:rPr>
-      </w:pPr>
-      <w:r>
-        <w:rPr>
-          <w:rFonts w:ascii="Times New Roman" w:hAnsi="Times New Roman" w:cs="Times New Roman"/>
-          <w:i/>
-          <w:color w:val="073763"/>
-          <w:sz w:val="24"/>
-          <w:szCs w:val="24"/>
-        </w:rPr>
-        <w:t>Insérez une capture d’écran des règles entrantes et sortantes du groupe de sécurité créé.</w:t>
-      </w:r>
-    </w:p>
-    <w:p>
-      <w:pPr>
-        <w:rPr>
-          <w:rFonts w:ascii="Times New Roman" w:hAnsi="Times New Roman" w:cs="Times New Roman"/>
-          <w:i/>
-          <w:color w:val="073763"/>
-          <w:sz w:val="24"/>
-          <w:szCs w:val="24"/>
-        </w:rPr>
-      </w:pPr>
-      <w:r>
-        <w:rPr>
-          <w:rFonts w:ascii="Times New Roman" w:hAnsi="Times New Roman" w:cs="Times New Roman"/>
-          <w:i/>
-          <w:color w:val="073763"/>
-          <w:sz w:val="24"/>
-          <w:szCs w:val="24"/>
-        </w:rPr>
-        <w:t>Expliquez l’utilité de chaque règle du groupe de sécurité.</w:t>
+      <w:r>
+        <w:drawing>
+          <wp:inline distT="0" distB="0" distL="0" distR="0" wp14:anchorId="76C2029F" wp14:editId="4E68492B">
+            <wp:extent cx="5733415" cy="2944495"/>
+            <wp:effectExtent l="0" t="0" r="635" b="8255"/>
+            <wp:docPr id="4" name="Image 4"/>
+            <wp:cNvGraphicFramePr>
+              <a:graphicFrameLocks xmlns:a="http://schemas.openxmlformats.org/drawingml/2006/main" noChangeAspect="1"/>
+            </wp:cNvGraphicFramePr>
+            <a:graphic xmlns:a="http://schemas.openxmlformats.org/drawingml/2006/main">
+              <a:graphicData uri="http://schemas.openxmlformats.org/drawingml/2006/picture">
+                <pic:pic xmlns:pic="http://schemas.openxmlformats.org/drawingml/2006/picture">
+                  <pic:nvPicPr>
+                    <pic:cNvPr id="1" name=""/>
+                    <pic:cNvPicPr/>
+                  </pic:nvPicPr>
+                  <pic:blipFill>
+                    <a:blip r:embed="rId8"/>
+                    <a:stretch>
+                      <a:fillRect/>
+                    </a:stretch>
+                  </pic:blipFill>
+                  <pic:spPr>
+                    <a:xfrm>
+                      <a:off x="0" y="0"/>
+                      <a:ext cx="5733415" cy="2944495"/>
+                    </a:xfrm>
+                    <a:prstGeom prst="rect">
+                      <a:avLst/>
+                    </a:prstGeom>
+                  </pic:spPr>
+                </pic:pic>
+              </a:graphicData>
+            </a:graphic>
+          </wp:inline>
+        </w:drawing>
+      </w:r>
+    </w:p>
+    <w:p>
+      <w:r>
+        <w:drawing>
+          <wp:inline distT="0" distB="0" distL="0" distR="0" wp14:anchorId="710DCF1C" wp14:editId="2E28906A">
+            <wp:extent cx="5733415" cy="2943225"/>
+            <wp:effectExtent l="0" t="0" r="635" b="9525"/>
+            <wp:docPr id="5" name="Image 5"/>
+            <wp:cNvGraphicFramePr>
+              <a:graphicFrameLocks xmlns:a="http://schemas.openxmlformats.org/drawingml/2006/main" noChangeAspect="1"/>
+            </wp:cNvGraphicFramePr>
+            <a:graphic xmlns:a="http://schemas.openxmlformats.org/drawingml/2006/main">
+              <a:graphicData uri="http://schemas.openxmlformats.org/drawingml/2006/picture">
+                <pic:pic xmlns:pic="http://schemas.openxmlformats.org/drawingml/2006/picture">
+                  <pic:nvPicPr>
+                    <pic:cNvPr id="1" name=""/>
+                    <pic:cNvPicPr/>
+                  </pic:nvPicPr>
+                  <pic:blipFill>
+                    <a:blip r:embed="rId9"/>
+                    <a:stretch>
+                      <a:fillRect/>
+                    </a:stretch>
+                  </pic:blipFill>
+                  <pic:spPr>
+                    <a:xfrm>
+                      <a:off x="0" y="0"/>
+                      <a:ext cx="5733415" cy="2943225"/>
+                    </a:xfrm>
+                    <a:prstGeom prst="rect">
+                      <a:avLst/>
+                    </a:prstGeom>
+                  </pic:spPr>
+                </pic:pic>
+              </a:graphicData>
+            </a:graphic>
+          </wp:inline>
+        </w:drawing>
       </w:r>
     </w:p>
     <w:p>
@@ -11200,14 +12263,7 @@
         <w:rPr>
           <w:rFonts w:ascii="Times New Roman" w:hAnsi="Times New Roman" w:cs="Times New Roman"/>
         </w:rPr>
-        <w:lastRenderedPageBreak/>
-        <w:t>In</w:t>
-      </w:r>
-      <w:r>
-        <w:rPr>
-          <w:rFonts w:ascii="Times New Roman" w:hAnsi="Times New Roman" w:cs="Times New Roman"/>
-        </w:rPr>
-        <w:t>stance EC2</w:t>
+        <w:t>Instance EC2</w:t>
       </w:r>
     </w:p>
     <w:p>
@@ -11245,6 +12301,8 @@
           <w:szCs w:val="24"/>
         </w:rPr>
       </w:pPr>
+      <w:bookmarkStart w:id="9" w:name="_phgzyqar5bez" w:colFirst="0" w:colLast="0"/>
+      <w:bookmarkEnd w:id="9"/>
       <w:r>
         <w:rPr>
           <w:rFonts w:ascii="Times New Roman" w:hAnsi="Times New Roman" w:cs="Times New Roman"/>
@@ -11295,9 +12353,11 @@
           <w:sz w:val="24"/>
           <w:szCs w:val="24"/>
         </w:rPr>
-        <w:t>Avez-vous utilisé un script données utilisateu</w:t>
-      </w:r>
-      <w:r>
+        <w:t xml:space="preserve">Avez-vous utilisé un script données utilisateurs ou une connexion SSH ? </w:t>
+      </w:r>
+    </w:p>
+    <w:p>
+      <w:pPr>
         <w:rPr>
           <w:rFonts w:ascii="Times New Roman" w:hAnsi="Times New Roman" w:cs="Times New Roman"/>
           <w:i/>
@@ -11305,11 +12365,8 @@
           <w:sz w:val="24"/>
           <w:szCs w:val="24"/>
         </w:rPr>
-        <w:t xml:space="preserve">rs ou une connexion SSH ? </w:t>
-      </w:r>
-    </w:p>
-    <w:p>
-      <w:pPr>
+      </w:pPr>
+      <w:r>
         <w:rPr>
           <w:rFonts w:ascii="Times New Roman" w:hAnsi="Times New Roman" w:cs="Times New Roman"/>
           <w:i/>
@@ -11317,17 +12374,656 @@
           <w:sz w:val="24"/>
           <w:szCs w:val="24"/>
         </w:rPr>
-      </w:pPr>
-      <w:r>
-        <w:rPr>
-          <w:rFonts w:ascii="Times New Roman" w:hAnsi="Times New Roman" w:cs="Times New Roman"/>
-          <w:i/>
-          <w:color w:val="073763"/>
-          <w:sz w:val="24"/>
-          <w:szCs w:val="24"/>
-        </w:rPr>
         <w:t>Dans le cas où vous avez utilisé des données utilisateur, spécifiez le script utilisé et expliquez-le brièvement.</w:t>
       </w:r>
+    </w:p>
+    <w:p>
+      <w:pPr>
+        <w:rPr>
+          <w:rFonts w:ascii="Times New Roman" w:hAnsi="Times New Roman" w:cs="Times New Roman"/>
+          <w:iCs/>
+          <w:sz w:val="24"/>
+          <w:szCs w:val="24"/>
+        </w:rPr>
+      </w:pPr>
+      <w:r>
+        <w:rPr>
+          <w:rFonts w:ascii="Times New Roman" w:hAnsi="Times New Roman" w:cs="Times New Roman"/>
+          <w:iCs/>
+          <w:sz w:val="24"/>
+          <w:szCs w:val="24"/>
+        </w:rPr>
+        <w:t xml:space="preserve">J’ai </w:t>
+      </w:r>
+      <w:r>
+        <w:rPr>
+          <w:rFonts w:ascii="Times New Roman" w:hAnsi="Times New Roman" w:cs="Times New Roman"/>
+          <w:iCs/>
+          <w:sz w:val="24"/>
+          <w:szCs w:val="24"/>
+        </w:rPr>
+        <w:t xml:space="preserve">créer une instance </w:t>
+      </w:r>
+      <w:proofErr w:type="spellStart"/>
+      <w:r>
+        <w:rPr>
+          <w:rFonts w:ascii="Times New Roman" w:hAnsi="Times New Roman" w:cs="Times New Roman"/>
+          <w:iCs/>
+          <w:sz w:val="24"/>
+          <w:szCs w:val="24"/>
+        </w:rPr>
+        <w:t>ubuntu</w:t>
+      </w:r>
+      <w:proofErr w:type="spellEnd"/>
+      <w:r>
+        <w:rPr>
+          <w:rFonts w:ascii="Times New Roman" w:hAnsi="Times New Roman" w:cs="Times New Roman"/>
+          <w:iCs/>
+          <w:sz w:val="24"/>
+          <w:szCs w:val="24"/>
+        </w:rPr>
+        <w:t xml:space="preserve"> serveur</w:t>
+      </w:r>
+      <w:r>
+        <w:rPr>
+          <w:rFonts w:ascii="Times New Roman" w:hAnsi="Times New Roman" w:cs="Times New Roman"/>
+          <w:iCs/>
+          <w:sz w:val="24"/>
+          <w:szCs w:val="24"/>
+        </w:rPr>
+        <w:t xml:space="preserve"> avec un t</w:t>
+      </w:r>
+      <w:proofErr w:type="gramStart"/>
+      <w:r>
+        <w:rPr>
+          <w:rFonts w:ascii="Times New Roman" w:hAnsi="Times New Roman" w:cs="Times New Roman"/>
+          <w:iCs/>
+          <w:sz w:val="24"/>
+          <w:szCs w:val="24"/>
+        </w:rPr>
+        <w:t>3.large</w:t>
+      </w:r>
+      <w:proofErr w:type="gramEnd"/>
+      <w:r>
+        <w:rPr>
+          <w:rFonts w:ascii="Times New Roman" w:hAnsi="Times New Roman" w:cs="Times New Roman"/>
+          <w:iCs/>
+          <w:sz w:val="24"/>
+          <w:szCs w:val="24"/>
+        </w:rPr>
+        <w:t xml:space="preserve"> pour pouvoir lancer tout mes services. En plus, j’ai ajouté le groupe de sécurité pour y accéder à tous les port </w:t>
+      </w:r>
+      <w:proofErr w:type="spellStart"/>
+      <w:r>
+        <w:rPr>
+          <w:rFonts w:ascii="Times New Roman" w:hAnsi="Times New Roman" w:cs="Times New Roman"/>
+          <w:iCs/>
+          <w:sz w:val="24"/>
+          <w:szCs w:val="24"/>
+        </w:rPr>
+        <w:t>tcp</w:t>
+      </w:r>
+      <w:proofErr w:type="spellEnd"/>
+      <w:r>
+        <w:rPr>
+          <w:rFonts w:ascii="Times New Roman" w:hAnsi="Times New Roman" w:cs="Times New Roman"/>
+          <w:iCs/>
+          <w:sz w:val="24"/>
+          <w:szCs w:val="24"/>
+        </w:rPr>
+        <w:t xml:space="preserve"> (très mauvaise pratique, je devrais plutôt ouvrir seulement les ports que j’ai besoin). Pour installer docker j’ai utilisé le script suivant :</w:t>
+      </w:r>
+    </w:p>
+    <w:p>
+      <w:pPr>
+        <w:rPr>
+          <w:rFonts w:ascii="Times New Roman" w:hAnsi="Times New Roman" w:cs="Times New Roman"/>
+          <w:iCs/>
+          <w:sz w:val="24"/>
+          <w:szCs w:val="24"/>
+        </w:rPr>
+      </w:pPr>
+    </w:p>
+    <w:p>
+      <w:pPr>
+        <w:rPr>
+          <w:rFonts w:ascii="Times New Roman" w:hAnsi="Times New Roman" w:cs="Times New Roman"/>
+          <w:iCs/>
+          <w:sz w:val="24"/>
+          <w:szCs w:val="24"/>
+          <w:lang w:val="en-US"/>
+        </w:rPr>
+      </w:pPr>
+      <w:proofErr w:type="gramStart"/>
+      <w:r>
+        <w:rPr>
+          <w:rFonts w:ascii="Times New Roman" w:hAnsi="Times New Roman" w:cs="Times New Roman"/>
+          <w:iCs/>
+          <w:sz w:val="24"/>
+          <w:szCs w:val="24"/>
+          <w:lang w:val="en-US"/>
+        </w:rPr>
+        <w:lastRenderedPageBreak/>
+        <w:t>#!/</w:t>
+      </w:r>
+      <w:proofErr w:type="gramEnd"/>
+      <w:r>
+        <w:rPr>
+          <w:rFonts w:ascii="Times New Roman" w:hAnsi="Times New Roman" w:cs="Times New Roman"/>
+          <w:iCs/>
+          <w:sz w:val="24"/>
+          <w:szCs w:val="24"/>
+          <w:lang w:val="en-US"/>
+        </w:rPr>
+        <w:t>bin/bash</w:t>
+      </w:r>
+    </w:p>
+    <w:p>
+      <w:pPr>
+        <w:rPr>
+          <w:rFonts w:ascii="Times New Roman" w:hAnsi="Times New Roman" w:cs="Times New Roman"/>
+          <w:iCs/>
+          <w:sz w:val="24"/>
+          <w:szCs w:val="24"/>
+          <w:lang w:val="en-US"/>
+        </w:rPr>
+      </w:pPr>
+    </w:p>
+    <w:p>
+      <w:pPr>
+        <w:rPr>
+          <w:rFonts w:ascii="Times New Roman" w:hAnsi="Times New Roman" w:cs="Times New Roman"/>
+          <w:iCs/>
+          <w:sz w:val="24"/>
+          <w:szCs w:val="24"/>
+          <w:lang w:val="fr-CA"/>
+        </w:rPr>
+      </w:pPr>
+      <w:r>
+        <w:rPr>
+          <w:rFonts w:ascii="Times New Roman" w:hAnsi="Times New Roman" w:cs="Times New Roman"/>
+          <w:iCs/>
+          <w:sz w:val="24"/>
+          <w:szCs w:val="24"/>
+          <w:lang w:val="fr-CA"/>
+        </w:rPr>
+        <w:t xml:space="preserve"># Update le </w:t>
+      </w:r>
+      <w:proofErr w:type="spellStart"/>
+      <w:r>
+        <w:rPr>
+          <w:rFonts w:ascii="Times New Roman" w:hAnsi="Times New Roman" w:cs="Times New Roman"/>
+          <w:iCs/>
+          <w:sz w:val="24"/>
+          <w:szCs w:val="24"/>
+          <w:lang w:val="fr-CA"/>
+        </w:rPr>
+        <w:t>register</w:t>
+      </w:r>
+      <w:proofErr w:type="spellEnd"/>
+      <w:r>
+        <w:rPr>
+          <w:rFonts w:ascii="Times New Roman" w:hAnsi="Times New Roman" w:cs="Times New Roman"/>
+          <w:iCs/>
+          <w:sz w:val="24"/>
+          <w:szCs w:val="24"/>
+          <w:lang w:val="fr-CA"/>
+        </w:rPr>
+        <w:t xml:space="preserve"> des s</w:t>
+      </w:r>
+      <w:r>
+        <w:rPr>
+          <w:rFonts w:ascii="Times New Roman" w:hAnsi="Times New Roman" w:cs="Times New Roman"/>
+          <w:iCs/>
+          <w:sz w:val="24"/>
+          <w:szCs w:val="24"/>
+          <w:lang w:val="fr-CA"/>
+        </w:rPr>
+        <w:t>ervices</w:t>
+      </w:r>
+    </w:p>
+    <w:p>
+      <w:pPr>
+        <w:rPr>
+          <w:rFonts w:ascii="Times New Roman" w:hAnsi="Times New Roman" w:cs="Times New Roman"/>
+          <w:iCs/>
+          <w:sz w:val="24"/>
+          <w:szCs w:val="24"/>
+          <w:lang w:val="en-US"/>
+        </w:rPr>
+      </w:pPr>
+      <w:proofErr w:type="spellStart"/>
+      <w:r>
+        <w:rPr>
+          <w:rFonts w:ascii="Times New Roman" w:hAnsi="Times New Roman" w:cs="Times New Roman"/>
+          <w:iCs/>
+          <w:sz w:val="24"/>
+          <w:szCs w:val="24"/>
+          <w:lang w:val="en-US"/>
+        </w:rPr>
+        <w:t>sudo</w:t>
+      </w:r>
+      <w:proofErr w:type="spellEnd"/>
+      <w:r>
+        <w:rPr>
+          <w:rFonts w:ascii="Times New Roman" w:hAnsi="Times New Roman" w:cs="Times New Roman"/>
+          <w:iCs/>
+          <w:sz w:val="24"/>
+          <w:szCs w:val="24"/>
+          <w:lang w:val="en-US"/>
+        </w:rPr>
+        <w:t xml:space="preserve"> apt update</w:t>
+      </w:r>
+    </w:p>
+    <w:p>
+      <w:pPr>
+        <w:rPr>
+          <w:rFonts w:ascii="Times New Roman" w:hAnsi="Times New Roman" w:cs="Times New Roman"/>
+          <w:iCs/>
+          <w:sz w:val="24"/>
+          <w:szCs w:val="24"/>
+          <w:lang w:val="en-US"/>
+        </w:rPr>
+      </w:pPr>
+    </w:p>
+    <w:p>
+      <w:pPr>
+        <w:rPr>
+          <w:rFonts w:ascii="Times New Roman" w:hAnsi="Times New Roman" w:cs="Times New Roman"/>
+          <w:iCs/>
+          <w:sz w:val="24"/>
+          <w:szCs w:val="24"/>
+          <w:lang w:val="fr-CA"/>
+        </w:rPr>
+      </w:pPr>
+      <w:r>
+        <w:rPr>
+          <w:rFonts w:ascii="Times New Roman" w:hAnsi="Times New Roman" w:cs="Times New Roman"/>
+          <w:iCs/>
+          <w:sz w:val="24"/>
+          <w:szCs w:val="24"/>
+          <w:lang w:val="fr-CA"/>
+        </w:rPr>
+        <w:t xml:space="preserve"># Installe </w:t>
+      </w:r>
+      <w:proofErr w:type="spellStart"/>
+      <w:r>
+        <w:rPr>
+          <w:rFonts w:ascii="Times New Roman" w:hAnsi="Times New Roman" w:cs="Times New Roman"/>
+          <w:iCs/>
+          <w:sz w:val="24"/>
+          <w:szCs w:val="24"/>
+          <w:lang w:val="fr-CA"/>
+        </w:rPr>
+        <w:t>curl</w:t>
+      </w:r>
+      <w:proofErr w:type="spellEnd"/>
+      <w:r>
+        <w:rPr>
+          <w:rFonts w:ascii="Times New Roman" w:hAnsi="Times New Roman" w:cs="Times New Roman"/>
+          <w:iCs/>
+          <w:sz w:val="24"/>
+          <w:szCs w:val="24"/>
+          <w:lang w:val="fr-CA"/>
+        </w:rPr>
+        <w:t xml:space="preserve"> pour aller c</w:t>
+      </w:r>
+      <w:r>
+        <w:rPr>
+          <w:rFonts w:ascii="Times New Roman" w:hAnsi="Times New Roman" w:cs="Times New Roman"/>
+          <w:iCs/>
+          <w:sz w:val="24"/>
+          <w:szCs w:val="24"/>
+          <w:lang w:val="fr-CA"/>
+        </w:rPr>
+        <w:t>hercher le script de docker</w:t>
+      </w:r>
+    </w:p>
+    <w:p>
+      <w:pPr>
+        <w:rPr>
+          <w:rFonts w:ascii="Times New Roman" w:hAnsi="Times New Roman" w:cs="Times New Roman"/>
+          <w:iCs/>
+          <w:sz w:val="24"/>
+          <w:szCs w:val="24"/>
+          <w:lang w:val="en-US"/>
+        </w:rPr>
+      </w:pPr>
+      <w:proofErr w:type="spellStart"/>
+      <w:r>
+        <w:rPr>
+          <w:rFonts w:ascii="Times New Roman" w:hAnsi="Times New Roman" w:cs="Times New Roman"/>
+          <w:iCs/>
+          <w:sz w:val="24"/>
+          <w:szCs w:val="24"/>
+          <w:lang w:val="en-US"/>
+        </w:rPr>
+        <w:t>sudo</w:t>
+      </w:r>
+      <w:proofErr w:type="spellEnd"/>
+      <w:r>
+        <w:rPr>
+          <w:rFonts w:ascii="Times New Roman" w:hAnsi="Times New Roman" w:cs="Times New Roman"/>
+          <w:iCs/>
+          <w:sz w:val="24"/>
+          <w:szCs w:val="24"/>
+          <w:lang w:val="en-US"/>
+        </w:rPr>
+        <w:t xml:space="preserve"> apt install -y git curl</w:t>
+      </w:r>
+    </w:p>
+    <w:p>
+      <w:pPr>
+        <w:rPr>
+          <w:rFonts w:ascii="Times New Roman" w:hAnsi="Times New Roman" w:cs="Times New Roman"/>
+          <w:iCs/>
+          <w:sz w:val="24"/>
+          <w:szCs w:val="24"/>
+          <w:lang w:val="en-US"/>
+        </w:rPr>
+      </w:pPr>
+    </w:p>
+    <w:p>
+      <w:pPr>
+        <w:rPr>
+          <w:rFonts w:ascii="Times New Roman" w:hAnsi="Times New Roman" w:cs="Times New Roman"/>
+          <w:iCs/>
+          <w:sz w:val="24"/>
+          <w:szCs w:val="24"/>
+          <w:lang w:val="fr-CA"/>
+        </w:rPr>
+      </w:pPr>
+      <w:r>
+        <w:rPr>
+          <w:rFonts w:ascii="Times New Roman" w:hAnsi="Times New Roman" w:cs="Times New Roman"/>
+          <w:iCs/>
+          <w:sz w:val="24"/>
+          <w:szCs w:val="24"/>
+          <w:lang w:val="fr-CA"/>
+        </w:rPr>
+        <w:t># Aller chercher le script d</w:t>
+      </w:r>
+      <w:r>
+        <w:rPr>
+          <w:rFonts w:ascii="Times New Roman" w:hAnsi="Times New Roman" w:cs="Times New Roman"/>
+          <w:iCs/>
+          <w:sz w:val="24"/>
+          <w:szCs w:val="24"/>
+          <w:lang w:val="fr-CA"/>
+        </w:rPr>
+        <w:t>’installation avec docker</w:t>
+      </w:r>
+    </w:p>
+    <w:p>
+      <w:pPr>
+        <w:rPr>
+          <w:rFonts w:ascii="Times New Roman" w:hAnsi="Times New Roman" w:cs="Times New Roman"/>
+          <w:iCs/>
+          <w:sz w:val="24"/>
+          <w:szCs w:val="24"/>
+          <w:lang w:val="en-US"/>
+        </w:rPr>
+      </w:pPr>
+      <w:proofErr w:type="spellStart"/>
+      <w:r>
+        <w:rPr>
+          <w:rFonts w:ascii="Times New Roman" w:hAnsi="Times New Roman" w:cs="Times New Roman"/>
+          <w:iCs/>
+          <w:sz w:val="24"/>
+          <w:szCs w:val="24"/>
+          <w:lang w:val="en-US"/>
+        </w:rPr>
+        <w:t>sudo</w:t>
+      </w:r>
+      <w:proofErr w:type="spellEnd"/>
+      <w:r>
+        <w:rPr>
+          <w:rFonts w:ascii="Times New Roman" w:hAnsi="Times New Roman" w:cs="Times New Roman"/>
+          <w:iCs/>
+          <w:sz w:val="24"/>
+          <w:szCs w:val="24"/>
+          <w:lang w:val="en-US"/>
+        </w:rPr>
+        <w:t xml:space="preserve"> curl -</w:t>
+      </w:r>
+      <w:proofErr w:type="spellStart"/>
+      <w:r>
+        <w:rPr>
+          <w:rFonts w:ascii="Times New Roman" w:hAnsi="Times New Roman" w:cs="Times New Roman"/>
+          <w:iCs/>
+          <w:sz w:val="24"/>
+          <w:szCs w:val="24"/>
+          <w:lang w:val="en-US"/>
+        </w:rPr>
+        <w:t>fsSL</w:t>
+      </w:r>
+      <w:proofErr w:type="spellEnd"/>
+      <w:r>
+        <w:rPr>
+          <w:rFonts w:ascii="Times New Roman" w:hAnsi="Times New Roman" w:cs="Times New Roman"/>
+          <w:iCs/>
+          <w:sz w:val="24"/>
+          <w:szCs w:val="24"/>
+          <w:lang w:val="en-US"/>
+        </w:rPr>
+        <w:t xml:space="preserve"> https://get.docker.com -o /opt/get-docker.sh</w:t>
+      </w:r>
+    </w:p>
+    <w:p>
+      <w:pPr>
+        <w:rPr>
+          <w:rFonts w:ascii="Times New Roman" w:hAnsi="Times New Roman" w:cs="Times New Roman"/>
+          <w:iCs/>
+          <w:sz w:val="24"/>
+          <w:szCs w:val="24"/>
+          <w:lang w:val="en-US"/>
+        </w:rPr>
+      </w:pPr>
+    </w:p>
+    <w:p>
+      <w:pPr>
+        <w:rPr>
+          <w:rFonts w:ascii="Times New Roman" w:hAnsi="Times New Roman" w:cs="Times New Roman"/>
+          <w:iCs/>
+          <w:sz w:val="24"/>
+          <w:szCs w:val="24"/>
+          <w:lang w:val="fr-CA"/>
+        </w:rPr>
+      </w:pPr>
+      <w:r>
+        <w:rPr>
+          <w:rFonts w:ascii="Times New Roman" w:hAnsi="Times New Roman" w:cs="Times New Roman"/>
+          <w:iCs/>
+          <w:sz w:val="24"/>
+          <w:szCs w:val="24"/>
+          <w:lang w:val="fr-CA"/>
+        </w:rPr>
+        <w:t># Installation de docker avec l</w:t>
+      </w:r>
+      <w:r>
+        <w:rPr>
+          <w:rFonts w:ascii="Times New Roman" w:hAnsi="Times New Roman" w:cs="Times New Roman"/>
+          <w:iCs/>
+          <w:sz w:val="24"/>
+          <w:szCs w:val="24"/>
+          <w:lang w:val="fr-CA"/>
+        </w:rPr>
+        <w:t xml:space="preserve">eur </w:t>
+      </w:r>
+      <w:proofErr w:type="gramStart"/>
+      <w:r>
+        <w:rPr>
+          <w:rFonts w:ascii="Times New Roman" w:hAnsi="Times New Roman" w:cs="Times New Roman"/>
+          <w:iCs/>
+          <w:sz w:val="24"/>
+          <w:szCs w:val="24"/>
+          <w:lang w:val="fr-CA"/>
+        </w:rPr>
+        <w:t>script  d’installation</w:t>
+      </w:r>
+      <w:proofErr w:type="gramEnd"/>
+    </w:p>
+    <w:p>
+      <w:pPr>
+        <w:rPr>
+          <w:rFonts w:ascii="Times New Roman" w:hAnsi="Times New Roman" w:cs="Times New Roman"/>
+          <w:iCs/>
+          <w:sz w:val="24"/>
+          <w:szCs w:val="24"/>
+          <w:lang w:val="en-US"/>
+        </w:rPr>
+      </w:pPr>
+      <w:proofErr w:type="spellStart"/>
+      <w:r>
+        <w:rPr>
+          <w:rFonts w:ascii="Times New Roman" w:hAnsi="Times New Roman" w:cs="Times New Roman"/>
+          <w:iCs/>
+          <w:sz w:val="24"/>
+          <w:szCs w:val="24"/>
+          <w:lang w:val="en-US"/>
+        </w:rPr>
+        <w:t>sudo</w:t>
+      </w:r>
+      <w:proofErr w:type="spellEnd"/>
+      <w:r>
+        <w:rPr>
+          <w:rFonts w:ascii="Times New Roman" w:hAnsi="Times New Roman" w:cs="Times New Roman"/>
+          <w:iCs/>
+          <w:sz w:val="24"/>
+          <w:szCs w:val="24"/>
+          <w:lang w:val="en-US"/>
+        </w:rPr>
+        <w:t xml:space="preserve"> </w:t>
+      </w:r>
+      <w:proofErr w:type="spellStart"/>
+      <w:r>
+        <w:rPr>
+          <w:rFonts w:ascii="Times New Roman" w:hAnsi="Times New Roman" w:cs="Times New Roman"/>
+          <w:iCs/>
+          <w:sz w:val="24"/>
+          <w:szCs w:val="24"/>
+          <w:lang w:val="en-US"/>
+        </w:rPr>
+        <w:t>sh</w:t>
+      </w:r>
+      <w:proofErr w:type="spellEnd"/>
+      <w:r>
+        <w:rPr>
+          <w:rFonts w:ascii="Times New Roman" w:hAnsi="Times New Roman" w:cs="Times New Roman"/>
+          <w:iCs/>
+          <w:sz w:val="24"/>
+          <w:szCs w:val="24"/>
+          <w:lang w:val="en-US"/>
+        </w:rPr>
+        <w:t xml:space="preserve"> /opt/get-docker.sh</w:t>
+      </w:r>
+    </w:p>
+    <w:p>
+      <w:pPr>
+        <w:rPr>
+          <w:rFonts w:ascii="Times New Roman" w:hAnsi="Times New Roman" w:cs="Times New Roman"/>
+          <w:iCs/>
+          <w:sz w:val="24"/>
+          <w:szCs w:val="24"/>
+          <w:lang w:val="en-US"/>
+        </w:rPr>
+      </w:pPr>
+      <w:r>
+        <w:rPr>
+          <w:rFonts w:ascii="Times New Roman" w:hAnsi="Times New Roman" w:cs="Times New Roman"/>
+          <w:iCs/>
+          <w:sz w:val="24"/>
+          <w:szCs w:val="24"/>
+          <w:lang w:val="en-US"/>
+        </w:rPr>
+        <w:t xml:space="preserve"> </w:t>
+      </w:r>
+    </w:p>
+    <w:p>
+      <w:pPr>
+        <w:rPr>
+          <w:rFonts w:ascii="Times New Roman" w:hAnsi="Times New Roman" w:cs="Times New Roman"/>
+          <w:iCs/>
+          <w:sz w:val="24"/>
+          <w:szCs w:val="24"/>
+          <w:lang w:val="fr-CA"/>
+        </w:rPr>
+      </w:pPr>
+      <w:r>
+        <w:rPr>
+          <w:rFonts w:ascii="Times New Roman" w:hAnsi="Times New Roman" w:cs="Times New Roman"/>
+          <w:iCs/>
+          <w:sz w:val="24"/>
+          <w:szCs w:val="24"/>
+          <w:lang w:val="fr-CA"/>
+        </w:rPr>
+        <w:t>Non je n’ai pa</w:t>
+      </w:r>
+      <w:r>
+        <w:rPr>
+          <w:rFonts w:ascii="Times New Roman" w:hAnsi="Times New Roman" w:cs="Times New Roman"/>
+          <w:iCs/>
+          <w:sz w:val="24"/>
+          <w:szCs w:val="24"/>
+          <w:lang w:val="fr-CA"/>
+        </w:rPr>
+        <w:t xml:space="preserve">s </w:t>
+      </w:r>
+      <w:proofErr w:type="gramStart"/>
+      <w:r>
+        <w:rPr>
+          <w:rFonts w:ascii="Times New Roman" w:hAnsi="Times New Roman" w:cs="Times New Roman"/>
+          <w:iCs/>
+          <w:sz w:val="24"/>
+          <w:szCs w:val="24"/>
+          <w:lang w:val="fr-CA"/>
+        </w:rPr>
+        <w:t>ajouter</w:t>
+      </w:r>
+      <w:proofErr w:type="gramEnd"/>
+      <w:r>
+        <w:rPr>
+          <w:rFonts w:ascii="Times New Roman" w:hAnsi="Times New Roman" w:cs="Times New Roman"/>
+          <w:iCs/>
+          <w:sz w:val="24"/>
+          <w:szCs w:val="24"/>
+          <w:lang w:val="fr-CA"/>
+        </w:rPr>
+        <w:t xml:space="preserve"> de script de démarrage, je me suis plutôt connecter en </w:t>
+      </w:r>
+      <w:proofErr w:type="spellStart"/>
+      <w:r>
+        <w:rPr>
+          <w:rFonts w:ascii="Times New Roman" w:hAnsi="Times New Roman" w:cs="Times New Roman"/>
+          <w:iCs/>
+          <w:sz w:val="24"/>
+          <w:szCs w:val="24"/>
+          <w:lang w:val="fr-CA"/>
+        </w:rPr>
+        <w:t>ssh</w:t>
+      </w:r>
+      <w:proofErr w:type="spellEnd"/>
+      <w:r>
+        <w:rPr>
+          <w:rFonts w:ascii="Times New Roman" w:hAnsi="Times New Roman" w:cs="Times New Roman"/>
+          <w:iCs/>
+          <w:sz w:val="24"/>
+          <w:szCs w:val="24"/>
+          <w:lang w:val="fr-CA"/>
+        </w:rPr>
+        <w:t xml:space="preserve"> pour installer docker et clone un de mes repositories pour avoir accès au docker compose.</w:t>
+      </w:r>
+    </w:p>
+    <w:p>
+      <w:pPr>
+        <w:rPr>
+          <w:rFonts w:ascii="Times New Roman" w:hAnsi="Times New Roman" w:cs="Times New Roman"/>
+          <w:iCs/>
+          <w:sz w:val="24"/>
+          <w:szCs w:val="24"/>
+          <w:lang w:val="fr-CA"/>
+        </w:rPr>
+      </w:pPr>
     </w:p>
     <w:p>
       <w:pPr>
@@ -11342,8 +13038,6 @@
           <w:szCs w:val="24"/>
         </w:rPr>
       </w:pPr>
-      <w:bookmarkStart w:id="9" w:name="_phgzyqar5bez" w:colFirst="0" w:colLast="0"/>
-      <w:bookmarkEnd w:id="9"/>
       <w:r>
         <w:rPr>
           <w:rFonts w:ascii="Times New Roman" w:hAnsi="Times New Roman" w:cs="Times New Roman"/>
@@ -11354,34 +13048,42 @@
       </w:r>
     </w:p>
     <w:p>
-      <w:pPr>
-        <w:rPr>
-          <w:rFonts w:ascii="Times New Roman" w:hAnsi="Times New Roman" w:cs="Times New Roman"/>
-          <w:i/>
-          <w:color w:val="073763"/>
-          <w:sz w:val="24"/>
-          <w:szCs w:val="24"/>
-        </w:rPr>
-      </w:pPr>
-      <w:r>
-        <w:rPr>
-          <w:rFonts w:ascii="Times New Roman" w:hAnsi="Times New Roman" w:cs="Times New Roman"/>
-          <w:i/>
-          <w:color w:val="073763"/>
-          <w:sz w:val="24"/>
-          <w:szCs w:val="24"/>
-        </w:rPr>
-        <w:t>Insérez une capture d’écran (ou spécifiez le nom du fichier remis) de l’onglet “détails” de v</w:t>
-      </w:r>
-      <w:r>
-        <w:rPr>
-          <w:rFonts w:ascii="Times New Roman" w:hAnsi="Times New Roman" w:cs="Times New Roman"/>
-          <w:i/>
-          <w:color w:val="073763"/>
-          <w:sz w:val="24"/>
-          <w:szCs w:val="24"/>
-        </w:rPr>
-        <w:t>otre instance.</w:t>
+      <w:r>
+        <w:drawing>
+          <wp:inline distT="0" distB="0" distL="0" distR="0" wp14:anchorId="24A4E05A" wp14:editId="114CBE66">
+            <wp:extent cx="5733415" cy="2901315"/>
+            <wp:effectExtent l="0" t="0" r="635" b="0"/>
+            <wp:docPr id="7" name="Image 7"/>
+            <wp:cNvGraphicFramePr>
+              <a:graphicFrameLocks xmlns:a="http://schemas.openxmlformats.org/drawingml/2006/main" noChangeAspect="1"/>
+            </wp:cNvGraphicFramePr>
+            <a:graphic xmlns:a="http://schemas.openxmlformats.org/drawingml/2006/main">
+              <a:graphicData uri="http://schemas.openxmlformats.org/drawingml/2006/picture">
+                <pic:pic xmlns:pic="http://schemas.openxmlformats.org/drawingml/2006/picture">
+                  <pic:nvPicPr>
+                    <pic:cNvPr id="1" name=""/>
+                    <pic:cNvPicPr/>
+                  </pic:nvPicPr>
+                  <pic:blipFill>
+                    <a:blip r:embed="rId10"/>
+                    <a:stretch>
+                      <a:fillRect/>
+                    </a:stretch>
+                  </pic:blipFill>
+                  <pic:spPr>
+                    <a:xfrm>
+                      <a:off x="0" y="0"/>
+                      <a:ext cx="5733415" cy="2901315"/>
+                    </a:xfrm>
+                    <a:prstGeom prst="rect">
+                      <a:avLst/>
+                    </a:prstGeom>
+                  </pic:spPr>
+                </pic:pic>
+              </a:graphicData>
+            </a:graphic>
+          </wp:inline>
+        </w:drawing>
       </w:r>
     </w:p>
     <w:p>
@@ -11397,34 +13099,53 @@
           <w:szCs w:val="24"/>
         </w:rPr>
       </w:pPr>
-      <w:bookmarkStart w:id="10" w:name="_ts5v1qqo4z8" w:colFirst="0" w:colLast="0"/>
-      <w:bookmarkEnd w:id="10"/>
-      <w:r>
-        <w:rPr>
-          <w:rFonts w:ascii="Times New Roman" w:hAnsi="Times New Roman" w:cs="Times New Roman"/>
-          <w:sz w:val="24"/>
-          <w:szCs w:val="24"/>
-        </w:rPr>
+      <w:r>
+        <w:rPr>
+          <w:rFonts w:ascii="Times New Roman" w:hAnsi="Times New Roman" w:cs="Times New Roman"/>
+          <w:sz w:val="24"/>
+          <w:szCs w:val="24"/>
+        </w:rPr>
+        <w:lastRenderedPageBreak/>
         <w:t>Sécurité de l’instance</w:t>
       </w:r>
     </w:p>
     <w:p>
-      <w:pPr>
-        <w:rPr>
-          <w:rFonts w:ascii="Times New Roman" w:hAnsi="Times New Roman" w:cs="Times New Roman"/>
-          <w:sz w:val="24"/>
-          <w:szCs w:val="24"/>
-        </w:rPr>
-      </w:pPr>
-      <w:r>
-        <w:rPr>
-          <w:rFonts w:ascii="Times New Roman" w:hAnsi="Times New Roman" w:cs="Times New Roman"/>
-          <w:i/>
-          <w:color w:val="073763"/>
-          <w:sz w:val="24"/>
-          <w:szCs w:val="24"/>
-        </w:rPr>
-        <w:t>Insérez une capture d’écran (ou spécifiez le nom du fichier remis) de l’onglet “sécurité” de votre instance</w:t>
+      <w:r>
+        <w:drawing>
+          <wp:inline distT="0" distB="0" distL="0" distR="0" wp14:anchorId="7C996AFB" wp14:editId="55C266C8">
+            <wp:extent cx="5733415" cy="2940050"/>
+            <wp:effectExtent l="0" t="0" r="635" b="0"/>
+            <wp:docPr id="8" name="Image 8"/>
+            <wp:cNvGraphicFramePr>
+              <a:graphicFrameLocks xmlns:a="http://schemas.openxmlformats.org/drawingml/2006/main" noChangeAspect="1"/>
+            </wp:cNvGraphicFramePr>
+            <a:graphic xmlns:a="http://schemas.openxmlformats.org/drawingml/2006/main">
+              <a:graphicData uri="http://schemas.openxmlformats.org/drawingml/2006/picture">
+                <pic:pic xmlns:pic="http://schemas.openxmlformats.org/drawingml/2006/picture">
+                  <pic:nvPicPr>
+                    <pic:cNvPr id="1" name=""/>
+                    <pic:cNvPicPr/>
+                  </pic:nvPicPr>
+                  <pic:blipFill>
+                    <a:blip r:embed="rId11"/>
+                    <a:stretch>
+                      <a:fillRect/>
+                    </a:stretch>
+                  </pic:blipFill>
+                  <pic:spPr>
+                    <a:xfrm>
+                      <a:off x="0" y="0"/>
+                      <a:ext cx="5733415" cy="2940050"/>
+                    </a:xfrm>
+                    <a:prstGeom prst="rect">
+                      <a:avLst/>
+                    </a:prstGeom>
+                  </pic:spPr>
+                </pic:pic>
+              </a:graphicData>
+            </a:graphic>
+          </wp:inline>
+        </w:drawing>
       </w:r>
     </w:p>
     <w:p>
@@ -11440,8 +13161,8 @@
           <w:szCs w:val="24"/>
         </w:rPr>
       </w:pPr>
-      <w:bookmarkStart w:id="11" w:name="_4not2i5dx6vk" w:colFirst="0" w:colLast="0"/>
-      <w:bookmarkEnd w:id="11"/>
+      <w:bookmarkStart w:id="10" w:name="_4not2i5dx6vk" w:colFirst="0" w:colLast="0"/>
+      <w:bookmarkEnd w:id="10"/>
       <w:r>
         <w:rPr>
           <w:rFonts w:ascii="Times New Roman" w:hAnsi="Times New Roman" w:cs="Times New Roman"/>
@@ -11453,33 +13174,354 @@
     </w:p>
     <w:p>
       <w:pPr>
-        <w:rPr>
-          <w:rFonts w:ascii="Times New Roman" w:hAnsi="Times New Roman" w:cs="Times New Roman"/>
-          <w:sz w:val="24"/>
-          <w:szCs w:val="24"/>
-        </w:rPr>
-      </w:pPr>
-      <w:r>
-        <w:rPr>
-          <w:rFonts w:ascii="Times New Roman" w:hAnsi="Times New Roman" w:cs="Times New Roman"/>
-          <w:i/>
-          <w:color w:val="073763"/>
-          <w:sz w:val="24"/>
-          <w:szCs w:val="24"/>
-        </w:rPr>
-        <w:t>Insérez une capture d’écran montrant que vous pouvez accéder à vos services via un navigateur (en mon</w:t>
-      </w:r>
-      <w:r>
-        <w:rPr>
-          <w:rFonts w:ascii="Times New Roman" w:hAnsi="Times New Roman" w:cs="Times New Roman"/>
-          <w:i/>
-          <w:color w:val="073763"/>
-          <w:sz w:val="24"/>
-          <w:szCs w:val="24"/>
-        </w:rPr>
-        <w:t>trant l’URL utilisé)</w:t>
-      </w:r>
-    </w:p>
+        <w:pStyle w:val="Titre6"/>
+      </w:pPr>
+      <w:proofErr w:type="spellStart"/>
+      <w:r>
+        <w:t>Portainer</w:t>
+      </w:r>
+      <w:proofErr w:type="spellEnd"/>
+      <w:r>
+        <w:t> :</w:t>
+      </w:r>
+    </w:p>
+    <w:p>
+      <w:pPr>
+        <w:rPr>
+          <w:rFonts w:ascii="Times New Roman" w:hAnsi="Times New Roman" w:cs="Times New Roman"/>
+          <w:sz w:val="24"/>
+          <w:szCs w:val="24"/>
+        </w:rPr>
+      </w:pPr>
+      <w:r>
+        <w:rPr>
+          <w:rFonts w:ascii="Times New Roman" w:hAnsi="Times New Roman" w:cs="Times New Roman"/>
+          <w:sz w:val="24"/>
+          <w:szCs w:val="24"/>
+        </w:rPr>
+        <w:drawing>
+          <wp:inline distT="0" distB="0" distL="0" distR="0" wp14:anchorId="0F82E263" wp14:editId="6570B1B6">
+            <wp:extent cx="5733415" cy="2956560"/>
+            <wp:effectExtent l="0" t="0" r="635" b="0"/>
+            <wp:docPr id="9" name="Image 9"/>
+            <wp:cNvGraphicFramePr>
+              <a:graphicFrameLocks xmlns:a="http://schemas.openxmlformats.org/drawingml/2006/main" noChangeAspect="1"/>
+            </wp:cNvGraphicFramePr>
+            <a:graphic xmlns:a="http://schemas.openxmlformats.org/drawingml/2006/main">
+              <a:graphicData uri="http://schemas.openxmlformats.org/drawingml/2006/picture">
+                <pic:pic xmlns:pic="http://schemas.openxmlformats.org/drawingml/2006/picture">
+                  <pic:nvPicPr>
+                    <pic:cNvPr id="1" name=""/>
+                    <pic:cNvPicPr/>
+                  </pic:nvPicPr>
+                  <pic:blipFill>
+                    <a:blip r:embed="rId12"/>
+                    <a:stretch>
+                      <a:fillRect/>
+                    </a:stretch>
+                  </pic:blipFill>
+                  <pic:spPr>
+                    <a:xfrm>
+                      <a:off x="0" y="0"/>
+                      <a:ext cx="5733415" cy="2956560"/>
+                    </a:xfrm>
+                    <a:prstGeom prst="rect">
+                      <a:avLst/>
+                    </a:prstGeom>
+                  </pic:spPr>
+                </pic:pic>
+              </a:graphicData>
+            </a:graphic>
+          </wp:inline>
+        </w:drawing>
+      </w:r>
+    </w:p>
+    <w:p>
+      <w:pPr>
+        <w:rPr>
+          <w:rFonts w:ascii="Times New Roman" w:hAnsi="Times New Roman" w:cs="Times New Roman"/>
+          <w:sz w:val="24"/>
+          <w:szCs w:val="24"/>
+        </w:rPr>
+      </w:pPr>
+    </w:p>
+    <w:p>
+      <w:pPr>
+        <w:pStyle w:val="Titre6"/>
+      </w:pPr>
+      <w:proofErr w:type="spellStart"/>
+      <w:r>
+        <w:lastRenderedPageBreak/>
+        <w:t>Traefik</w:t>
+      </w:r>
+      <w:proofErr w:type="spellEnd"/>
+      <w:r>
+        <w:t> :</w:t>
+      </w:r>
+    </w:p>
+    <w:p>
+      <w:pPr>
+        <w:rPr>
+          <w:rFonts w:ascii="Times New Roman" w:hAnsi="Times New Roman" w:cs="Times New Roman"/>
+          <w:sz w:val="24"/>
+          <w:szCs w:val="24"/>
+        </w:rPr>
+      </w:pPr>
+      <w:r>
+        <w:rPr>
+          <w:rFonts w:ascii="Times New Roman" w:hAnsi="Times New Roman" w:cs="Times New Roman"/>
+          <w:sz w:val="24"/>
+          <w:szCs w:val="24"/>
+        </w:rPr>
+        <w:drawing>
+          <wp:inline distT="0" distB="0" distL="0" distR="0" wp14:anchorId="4C5F3E1A" wp14:editId="52D57C13">
+            <wp:extent cx="5733415" cy="2961005"/>
+            <wp:effectExtent l="0" t="0" r="635" b="0"/>
+            <wp:docPr id="10" name="Image 10"/>
+            <wp:cNvGraphicFramePr>
+              <a:graphicFrameLocks xmlns:a="http://schemas.openxmlformats.org/drawingml/2006/main" noChangeAspect="1"/>
+            </wp:cNvGraphicFramePr>
+            <a:graphic xmlns:a="http://schemas.openxmlformats.org/drawingml/2006/main">
+              <a:graphicData uri="http://schemas.openxmlformats.org/drawingml/2006/picture">
+                <pic:pic xmlns:pic="http://schemas.openxmlformats.org/drawingml/2006/picture">
+                  <pic:nvPicPr>
+                    <pic:cNvPr id="1" name=""/>
+                    <pic:cNvPicPr/>
+                  </pic:nvPicPr>
+                  <pic:blipFill>
+                    <a:blip r:embed="rId13"/>
+                    <a:stretch>
+                      <a:fillRect/>
+                    </a:stretch>
+                  </pic:blipFill>
+                  <pic:spPr>
+                    <a:xfrm>
+                      <a:off x="0" y="0"/>
+                      <a:ext cx="5733415" cy="2961005"/>
+                    </a:xfrm>
+                    <a:prstGeom prst="rect">
+                      <a:avLst/>
+                    </a:prstGeom>
+                  </pic:spPr>
+                </pic:pic>
+              </a:graphicData>
+            </a:graphic>
+          </wp:inline>
+        </w:drawing>
+      </w:r>
+    </w:p>
+    <w:p>
+      <w:pPr>
+        <w:rPr>
+          <w:rFonts w:ascii="Times New Roman" w:hAnsi="Times New Roman" w:cs="Times New Roman"/>
+          <w:sz w:val="24"/>
+          <w:szCs w:val="24"/>
+        </w:rPr>
+      </w:pPr>
+    </w:p>
+    <w:p>
+      <w:pPr>
+        <w:pStyle w:val="Titre6"/>
+      </w:pPr>
+      <w:proofErr w:type="spellStart"/>
+      <w:r>
+        <w:t>Nextcloud</w:t>
+      </w:r>
+      <w:proofErr w:type="spellEnd"/>
+      <w:r>
+        <w:t> :</w:t>
+      </w:r>
+    </w:p>
+    <w:p>
+      <w:r>
+        <w:drawing>
+          <wp:inline distT="0" distB="0" distL="0" distR="0" wp14:anchorId="25F5E7E1" wp14:editId="7207025C">
+            <wp:extent cx="5733415" cy="2969895"/>
+            <wp:effectExtent l="0" t="0" r="635" b="1905"/>
+            <wp:docPr id="11" name="Image 11"/>
+            <wp:cNvGraphicFramePr>
+              <a:graphicFrameLocks xmlns:a="http://schemas.openxmlformats.org/drawingml/2006/main" noChangeAspect="1"/>
+            </wp:cNvGraphicFramePr>
+            <a:graphic xmlns:a="http://schemas.openxmlformats.org/drawingml/2006/main">
+              <a:graphicData uri="http://schemas.openxmlformats.org/drawingml/2006/picture">
+                <pic:pic xmlns:pic="http://schemas.openxmlformats.org/drawingml/2006/picture">
+                  <pic:nvPicPr>
+                    <pic:cNvPr id="1" name=""/>
+                    <pic:cNvPicPr/>
+                  </pic:nvPicPr>
+                  <pic:blipFill>
+                    <a:blip r:embed="rId14"/>
+                    <a:stretch>
+                      <a:fillRect/>
+                    </a:stretch>
+                  </pic:blipFill>
+                  <pic:spPr>
+                    <a:xfrm>
+                      <a:off x="0" y="0"/>
+                      <a:ext cx="5733415" cy="2969895"/>
+                    </a:xfrm>
+                    <a:prstGeom prst="rect">
+                      <a:avLst/>
+                    </a:prstGeom>
+                  </pic:spPr>
+                </pic:pic>
+              </a:graphicData>
+            </a:graphic>
+          </wp:inline>
+        </w:drawing>
+      </w:r>
+    </w:p>
+    <w:p>
+      <w:pPr>
+        <w:pStyle w:val="Titre6"/>
+      </w:pPr>
+      <w:proofErr w:type="spellStart"/>
+      <w:r>
+        <w:lastRenderedPageBreak/>
+        <w:t>Jellyfin</w:t>
+      </w:r>
+      <w:proofErr w:type="spellEnd"/>
+      <w:r>
+        <w:t> :</w:t>
+      </w:r>
+    </w:p>
+    <w:p>
+      <w:r>
+        <w:drawing>
+          <wp:inline distT="0" distB="0" distL="0" distR="0" wp14:anchorId="4AC827B8" wp14:editId="306122AF">
+            <wp:extent cx="5733415" cy="2973070"/>
+            <wp:effectExtent l="0" t="0" r="635" b="0"/>
+            <wp:docPr id="12" name="Image 12"/>
+            <wp:cNvGraphicFramePr>
+              <a:graphicFrameLocks xmlns:a="http://schemas.openxmlformats.org/drawingml/2006/main" noChangeAspect="1"/>
+            </wp:cNvGraphicFramePr>
+            <a:graphic xmlns:a="http://schemas.openxmlformats.org/drawingml/2006/main">
+              <a:graphicData uri="http://schemas.openxmlformats.org/drawingml/2006/picture">
+                <pic:pic xmlns:pic="http://schemas.openxmlformats.org/drawingml/2006/picture">
+                  <pic:nvPicPr>
+                    <pic:cNvPr id="1" name=""/>
+                    <pic:cNvPicPr/>
+                  </pic:nvPicPr>
+                  <pic:blipFill>
+                    <a:blip r:embed="rId15"/>
+                    <a:stretch>
+                      <a:fillRect/>
+                    </a:stretch>
+                  </pic:blipFill>
+                  <pic:spPr>
+                    <a:xfrm>
+                      <a:off x="0" y="0"/>
+                      <a:ext cx="5733415" cy="2973070"/>
+                    </a:xfrm>
+                    <a:prstGeom prst="rect">
+                      <a:avLst/>
+                    </a:prstGeom>
+                  </pic:spPr>
+                </pic:pic>
+              </a:graphicData>
+            </a:graphic>
+          </wp:inline>
+        </w:drawing>
+      </w:r>
+    </w:p>
+    <w:p/>
+    <w:p>
+      <w:pPr>
+        <w:pStyle w:val="Titre6"/>
+      </w:pPr>
+      <w:r>
+        <w:t>Frontend :</w:t>
+      </w:r>
+    </w:p>
+    <w:p>
+      <w:r>
+        <w:drawing>
+          <wp:inline distT="0" distB="0" distL="0" distR="0" wp14:anchorId="73A732B4" wp14:editId="40459E4D">
+            <wp:extent cx="5733415" cy="2956560"/>
+            <wp:effectExtent l="0" t="0" r="635" b="0"/>
+            <wp:docPr id="14" name="Image 14"/>
+            <wp:cNvGraphicFramePr>
+              <a:graphicFrameLocks xmlns:a="http://schemas.openxmlformats.org/drawingml/2006/main" noChangeAspect="1"/>
+            </wp:cNvGraphicFramePr>
+            <a:graphic xmlns:a="http://schemas.openxmlformats.org/drawingml/2006/main">
+              <a:graphicData uri="http://schemas.openxmlformats.org/drawingml/2006/picture">
+                <pic:pic xmlns:pic="http://schemas.openxmlformats.org/drawingml/2006/picture">
+                  <pic:nvPicPr>
+                    <pic:cNvPr id="1" name=""/>
+                    <pic:cNvPicPr/>
+                  </pic:nvPicPr>
+                  <pic:blipFill>
+                    <a:blip r:embed="rId16"/>
+                    <a:stretch>
+                      <a:fillRect/>
+                    </a:stretch>
+                  </pic:blipFill>
+                  <pic:spPr>
+                    <a:xfrm>
+                      <a:off x="0" y="0"/>
+                      <a:ext cx="5733415" cy="2956560"/>
+                    </a:xfrm>
+                    <a:prstGeom prst="rect">
+                      <a:avLst/>
+                    </a:prstGeom>
+                  </pic:spPr>
+                </pic:pic>
+              </a:graphicData>
+            </a:graphic>
+          </wp:inline>
+        </w:drawing>
+      </w:r>
+    </w:p>
+    <w:p/>
+    <w:p>
+      <w:pPr>
+        <w:pStyle w:val="Titre6"/>
+      </w:pPr>
+      <w:r>
+        <w:lastRenderedPageBreak/>
+        <w:t>Backend :</w:t>
+      </w:r>
+    </w:p>
+    <w:p>
+      <w:r>
+        <w:drawing>
+          <wp:inline distT="0" distB="0" distL="0" distR="0" wp14:anchorId="395C584D" wp14:editId="26B46002">
+            <wp:extent cx="5733415" cy="2969895"/>
+            <wp:effectExtent l="0" t="0" r="635" b="1905"/>
+            <wp:docPr id="13" name="Image 13"/>
+            <wp:cNvGraphicFramePr>
+              <a:graphicFrameLocks xmlns:a="http://schemas.openxmlformats.org/drawingml/2006/main" noChangeAspect="1"/>
+            </wp:cNvGraphicFramePr>
+            <a:graphic xmlns:a="http://schemas.openxmlformats.org/drawingml/2006/main">
+              <a:graphicData uri="http://schemas.openxmlformats.org/drawingml/2006/picture">
+                <pic:pic xmlns:pic="http://schemas.openxmlformats.org/drawingml/2006/picture">
+                  <pic:nvPicPr>
+                    <pic:cNvPr id="1" name=""/>
+                    <pic:cNvPicPr/>
+                  </pic:nvPicPr>
+                  <pic:blipFill>
+                    <a:blip r:embed="rId17"/>
+                    <a:stretch>
+                      <a:fillRect/>
+                    </a:stretch>
+                  </pic:blipFill>
+                  <pic:spPr>
+                    <a:xfrm>
+                      <a:off x="0" y="0"/>
+                      <a:ext cx="5733415" cy="2969895"/>
+                    </a:xfrm>
+                    <a:prstGeom prst="rect">
+                      <a:avLst/>
+                    </a:prstGeom>
+                  </pic:spPr>
+                </pic:pic>
+              </a:graphicData>
+            </a:graphic>
+          </wp:inline>
+        </w:drawing>
+      </w:r>
+    </w:p>
+    <w:p/>
     <w:sectPr>
       <w:pgSz w:w="11909" w:h="16834"/>
       <w:pgMar w:top="1440" w:right="1440" w:bottom="1440" w:left="1440" w:header="720" w:footer="720" w:gutter="0"/>
@@ -12223,7 +14265,6 @@
     <w:basedOn w:val="Normal"/>
     <w:next w:val="Normal"/>
     <w:uiPriority w:val="9"/>
-    <w:semiHidden/>
     <w:unhideWhenUsed/>
     <w:qFormat/>
     <w:pPr>
@@ -12235,6 +14276,28 @@
     <w:rPr>
       <w:i/>
       <w:color w:val="666666"/>
+    </w:rPr>
+  </w:style>
+  <w:style w:type="paragraph" w:styleId="Titre7">
+    <w:name w:val="heading 7"/>
+    <w:basedOn w:val="Normal"/>
+    <w:next w:val="Normal"/>
+    <w:link w:val="Titre7Car"/>
+    <w:uiPriority w:val="9"/>
+    <w:unhideWhenUsed/>
+    <w:qFormat/>
+    <w:rsid w:val="00FF5E82"/>
+    <w:pPr>
+      <w:keepNext/>
+      <w:keepLines/>
+      <w:spacing w:before="40"/>
+      <w:outlineLvl w:val="6"/>
+    </w:pPr>
+    <w:rPr>
+      <w:rFonts w:asciiTheme="majorHAnsi" w:eastAsiaTheme="majorEastAsia" w:hAnsiTheme="majorHAnsi" w:cstheme="majorBidi"/>
+      <w:i/>
+      <w:iCs/>
+      <w:color w:val="243F60" w:themeColor="accent1" w:themeShade="7F"/>
     </w:rPr>
   </w:style>
   <w:style w:type="character" w:default="1" w:styleId="Policepardfaut">
@@ -12342,6 +14405,19 @@
       <w:ind w:left="720"/>
       <w:contextualSpacing/>
     </w:pPr>
+  </w:style>
+  <w:style w:type="character" w:customStyle="1" w:styleId="Titre7Car">
+    <w:name w:val="Titre 7 Car"/>
+    <w:basedOn w:val="Policepardfaut"/>
+    <w:link w:val="Titre7"/>
+    <w:uiPriority w:val="9"/>
+    <w:rsid w:val="00FF5E82"/>
+    <w:rPr>
+      <w:rFonts w:asciiTheme="majorHAnsi" w:eastAsiaTheme="majorEastAsia" w:hAnsiTheme="majorHAnsi" w:cstheme="majorBidi"/>
+      <w:i/>
+      <w:iCs/>
+      <w:color w:val="243F60" w:themeColor="accent1" w:themeShade="7F"/>
+    </w:rPr>
   </w:style>
 </w:styles>
 </file>

</xml_diff>